<commit_message>
Complete example final report
</commit_message>
<xml_diff>
--- a/example_final_report.docx
+++ b/example_final_report.docx
@@ -9,7 +9,6 @@
           <w:rStyle w:val="af"/>
         </w:rPr>
       </w:pPr>
-      <w:proofErr w:type="spellStart"/>
       <w:r>
         <w:rPr>
           <w:rStyle w:val="af"/>
@@ -17,7 +16,6 @@
         </w:rPr>
         <w:t>ㅣ</w:t>
       </w:r>
-      <w:proofErr w:type="spellEnd"/>
     </w:p>
     <w:p>
       <w:pPr>
@@ -40,7 +38,6 @@
           <w:dataBinding w:prefixMappings="xmlns:ns0='http://purl.org/dc/elements/1.1/' xmlns:ns1='http://schemas.openxmlformats.org/package/2006/metadata/core-properties' " w:xpath="/ns1:coreProperties[1]/ns0:creator[1]" w:storeItemID="{6C3C8BC8-F283-45AE-878A-BAB7291924A1}"/>
           <w:text/>
         </w:sdtPr>
-        <w:sdtEndPr/>
         <w:sdtContent>
           <w:r>
             <w:rPr>
@@ -91,7 +88,7 @@
             <w:sz w:val="22"/>
             <w:szCs w:val="24"/>
           </w:rPr>
-          <w:t>https://github.com/prulen/my-fork-test2.git</w:t>
+          <w:t>https://github.com/prulen/2026-final-test.git</w:t>
         </w:r>
       </w:hyperlink>
     </w:p>
@@ -165,164 +162,10 @@
               <w:spacing w:after="0" w:line="240" w:lineRule="auto"/>
               <w:rPr>
                 <w:rFonts w:ascii="Consolas" w:eastAsiaTheme="minorEastAsia" w:hAnsi="Consolas" w:cs="Consolas"/>
-                <w:b/>
-                <w:bCs/>
-                <w:color w:val="7F0055"/>
-                <w:sz w:val="20"/>
-              </w:rPr>
-            </w:pPr>
-            <w:proofErr w:type="gramStart"/>
-            <w:r>
-              <w:rPr>
-                <w:rFonts w:ascii="Consolas" w:eastAsiaTheme="minorEastAsia" w:hAnsi="Consolas" w:cs="Consolas" w:hint="eastAsia"/>
-                <w:b/>
-                <w:bCs/>
-                <w:color w:val="7F0055"/>
-                <w:sz w:val="20"/>
-              </w:rPr>
-              <w:t xml:space="preserve">// </w:t>
-            </w:r>
-            <w:r>
-              <w:rPr>
-                <w:rFonts w:ascii="Consolas" w:eastAsiaTheme="minorEastAsia" w:hAnsi="Consolas" w:cs="Consolas" w:hint="eastAsia"/>
-                <w:b/>
-                <w:bCs/>
-                <w:color w:val="7F0055"/>
-                <w:sz w:val="20"/>
-              </w:rPr>
-              <w:t>아래</w:t>
-            </w:r>
-            <w:proofErr w:type="gramEnd"/>
-            <w:r>
-              <w:rPr>
-                <w:rFonts w:ascii="Consolas" w:eastAsiaTheme="minorEastAsia" w:hAnsi="Consolas" w:cs="Consolas" w:hint="eastAsia"/>
-                <w:b/>
-                <w:bCs/>
-                <w:color w:val="7F0055"/>
-                <w:sz w:val="20"/>
-              </w:rPr>
-              <w:t xml:space="preserve"> </w:t>
-            </w:r>
-            <w:r>
-              <w:rPr>
-                <w:rFonts w:ascii="Consolas" w:eastAsiaTheme="minorEastAsia" w:hAnsi="Consolas" w:cs="Consolas" w:hint="eastAsia"/>
-                <w:b/>
-                <w:bCs/>
-                <w:color w:val="7F0055"/>
-                <w:sz w:val="20"/>
-              </w:rPr>
-              <w:t>내용</w:t>
-            </w:r>
-            <w:r>
-              <w:rPr>
-                <w:rFonts w:ascii="Consolas" w:eastAsiaTheme="minorEastAsia" w:hAnsi="Consolas" w:cs="Consolas" w:hint="eastAsia"/>
-                <w:b/>
-                <w:bCs/>
-                <w:color w:val="7F0055"/>
-                <w:sz w:val="20"/>
-              </w:rPr>
-              <w:t xml:space="preserve"> </w:t>
-            </w:r>
-            <w:r>
-              <w:rPr>
-                <w:rFonts w:ascii="Consolas" w:eastAsiaTheme="minorEastAsia" w:hAnsi="Consolas" w:cs="Consolas" w:hint="eastAsia"/>
-                <w:b/>
-                <w:bCs/>
-                <w:color w:val="7F0055"/>
-                <w:sz w:val="20"/>
-              </w:rPr>
-              <w:t>삭제</w:t>
-            </w:r>
-            <w:r>
-              <w:rPr>
-                <w:rFonts w:ascii="Consolas" w:eastAsiaTheme="minorEastAsia" w:hAnsi="Consolas" w:cs="Consolas" w:hint="eastAsia"/>
-                <w:b/>
-                <w:bCs/>
-                <w:color w:val="7F0055"/>
-                <w:sz w:val="20"/>
-              </w:rPr>
-              <w:t xml:space="preserve"> </w:t>
-            </w:r>
-            <w:r>
-              <w:rPr>
-                <w:rFonts w:ascii="Consolas" w:eastAsiaTheme="minorEastAsia" w:hAnsi="Consolas" w:cs="Consolas" w:hint="eastAsia"/>
-                <w:b/>
-                <w:bCs/>
-                <w:color w:val="7F0055"/>
-                <w:sz w:val="20"/>
-              </w:rPr>
-              <w:t>후</w:t>
-            </w:r>
-            <w:r>
-              <w:rPr>
-                <w:rFonts w:ascii="Consolas" w:eastAsiaTheme="minorEastAsia" w:hAnsi="Consolas" w:cs="Consolas" w:hint="eastAsia"/>
-                <w:b/>
-                <w:bCs/>
-                <w:color w:val="7F0055"/>
-                <w:sz w:val="20"/>
-              </w:rPr>
-              <w:t xml:space="preserve"> </w:t>
-            </w:r>
-            <w:r>
-              <w:rPr>
-                <w:rFonts w:ascii="Consolas" w:eastAsiaTheme="minorEastAsia" w:hAnsi="Consolas" w:cs="Consolas" w:hint="eastAsia"/>
-                <w:b/>
-                <w:bCs/>
-                <w:color w:val="7F0055"/>
-                <w:sz w:val="20"/>
-              </w:rPr>
-              <w:t>본인</w:t>
-            </w:r>
-            <w:r>
-              <w:rPr>
-                <w:rFonts w:ascii="Consolas" w:eastAsiaTheme="minorEastAsia" w:hAnsi="Consolas" w:cs="Consolas" w:hint="eastAsia"/>
-                <w:b/>
-                <w:bCs/>
-                <w:color w:val="7F0055"/>
-                <w:sz w:val="20"/>
-              </w:rPr>
-              <w:t xml:space="preserve"> </w:t>
-            </w:r>
-            <w:r>
-              <w:rPr>
-                <w:rFonts w:ascii="Consolas" w:eastAsiaTheme="minorEastAsia" w:hAnsi="Consolas" w:cs="Consolas" w:hint="eastAsia"/>
-                <w:b/>
-                <w:bCs/>
-                <w:color w:val="7F0055"/>
-                <w:sz w:val="20"/>
-              </w:rPr>
-              <w:t>코드로</w:t>
-            </w:r>
-            <w:r>
-              <w:rPr>
-                <w:rFonts w:ascii="Consolas" w:eastAsiaTheme="minorEastAsia" w:hAnsi="Consolas" w:cs="Consolas" w:hint="eastAsia"/>
-                <w:b/>
-                <w:bCs/>
-                <w:color w:val="7F0055"/>
-                <w:sz w:val="20"/>
-              </w:rPr>
-              <w:t xml:space="preserve"> </w:t>
-            </w:r>
-            <w:r>
-              <w:rPr>
-                <w:rFonts w:ascii="Consolas" w:eastAsiaTheme="minorEastAsia" w:hAnsi="Consolas" w:cs="Consolas" w:hint="eastAsia"/>
-                <w:b/>
-                <w:bCs/>
-                <w:color w:val="7F0055"/>
-                <w:sz w:val="20"/>
-              </w:rPr>
-              <w:t>대체</w:t>
-            </w:r>
-            <w:r>
-              <w:rPr>
-                <w:rFonts w:ascii="Consolas" w:eastAsiaTheme="minorEastAsia" w:hAnsi="Consolas" w:cs="Consolas" w:hint="eastAsia"/>
-                <w:b/>
-                <w:bCs/>
-                <w:color w:val="7F0055"/>
-                <w:sz w:val="20"/>
-              </w:rPr>
-              <w:t xml:space="preserve"> </w:t>
-            </w:r>
+                <w:color w:val="auto"/>
+                <w:sz w:val="20"/>
+              </w:rPr>
+            </w:pPr>
           </w:p>
           <w:p>
             <w:pPr>
@@ -332,11 +175,7 @@
               <w:adjustRightInd w:val="0"/>
               <w:spacing w:after="0" w:line="240" w:lineRule="auto"/>
               <w:rPr>
-                <w:rFonts w:ascii="Consolas" w:eastAsiaTheme="minorEastAsia" w:hAnsi="Consolas" w:cs="Consolas"/>
-                <w:b/>
-                <w:bCs/>
-                <w:color w:val="7F0055"/>
-                <w:sz w:val="20"/>
+                <w:rFonts w:ascii="Consolas" w:hAnsi="Consolas"/>
               </w:rPr>
             </w:pPr>
           </w:p>
@@ -348,57 +187,9 @@
               <w:adjustRightInd w:val="0"/>
               <w:spacing w:after="0" w:line="240" w:lineRule="auto"/>
               <w:rPr>
-                <w:rFonts w:ascii="Consolas" w:eastAsiaTheme="minorEastAsia" w:hAnsi="Consolas" w:cs="Consolas"/>
-                <w:color w:val="auto"/>
-                <w:sz w:val="20"/>
-              </w:rPr>
-            </w:pPr>
-            <w:r>
-              <w:rPr>
-                <w:rFonts w:ascii="Consolas" w:eastAsiaTheme="minorEastAsia" w:hAnsi="Consolas" w:cs="Consolas"/>
-                <w:b/>
-                <w:bCs/>
-                <w:color w:val="7F0055"/>
-                <w:sz w:val="20"/>
-              </w:rPr>
-              <w:t>import</w:t>
-            </w:r>
-            <w:r>
-              <w:rPr>
-                <w:rFonts w:ascii="Consolas" w:eastAsiaTheme="minorEastAsia" w:hAnsi="Consolas" w:cs="Consolas"/>
-                <w:color w:val="000000"/>
-                <w:sz w:val="20"/>
-              </w:rPr>
-              <w:t xml:space="preserve"> </w:t>
-            </w:r>
-            <w:proofErr w:type="spellStart"/>
-            <w:proofErr w:type="gramStart"/>
-            <w:r>
-              <w:rPr>
-                <w:rFonts w:ascii="Consolas" w:eastAsiaTheme="minorEastAsia" w:hAnsi="Consolas" w:cs="Consolas"/>
-                <w:color w:val="000000"/>
-                <w:sz w:val="20"/>
-              </w:rPr>
-              <w:t>java.util</w:t>
-            </w:r>
-            <w:proofErr w:type="gramEnd"/>
-            <w:r>
-              <w:rPr>
-                <w:rFonts w:ascii="Consolas" w:eastAsiaTheme="minorEastAsia" w:hAnsi="Consolas" w:cs="Consolas"/>
-                <w:color w:val="000000"/>
-                <w:sz w:val="20"/>
-              </w:rPr>
-              <w:t>.Scanner</w:t>
-            </w:r>
-            <w:proofErr w:type="spellEnd"/>
-            <w:r>
-              <w:rPr>
-                <w:rFonts w:ascii="Consolas" w:eastAsiaTheme="minorEastAsia" w:hAnsi="Consolas" w:cs="Consolas"/>
-                <w:color w:val="000000"/>
-                <w:sz w:val="20"/>
-              </w:rPr>
-              <w:t>;</w:t>
-            </w:r>
+                <w:rFonts w:ascii="Consolas" w:hAnsi="Consolas"/>
+              </w:rPr>
+            </w:pPr>
           </w:p>
           <w:p>
             <w:pPr>
@@ -408,9 +199,7 @@
               <w:adjustRightInd w:val="0"/>
               <w:spacing w:after="0" w:line="240" w:lineRule="auto"/>
               <w:rPr>
-                <w:rFonts w:ascii="Consolas" w:eastAsiaTheme="minorEastAsia" w:hAnsi="Consolas" w:cs="Consolas"/>
-                <w:color w:val="auto"/>
-                <w:sz w:val="20"/>
+                <w:rFonts w:ascii="Consolas" w:hAnsi="Consolas"/>
               </w:rPr>
             </w:pPr>
           </w:p>
@@ -422,65 +211,9 @@
               <w:adjustRightInd w:val="0"/>
               <w:spacing w:after="0" w:line="240" w:lineRule="auto"/>
               <w:rPr>
-                <w:rFonts w:ascii="Consolas" w:eastAsiaTheme="minorEastAsia" w:hAnsi="Consolas" w:cs="Consolas"/>
-                <w:color w:val="auto"/>
-                <w:sz w:val="20"/>
-              </w:rPr>
-            </w:pPr>
-            <w:r>
-              <w:rPr>
-                <w:rFonts w:ascii="Consolas" w:eastAsiaTheme="minorEastAsia" w:hAnsi="Consolas" w:cs="Consolas"/>
-                <w:b/>
-                <w:bCs/>
-                <w:color w:val="7F0055"/>
-                <w:sz w:val="20"/>
-              </w:rPr>
-              <w:t>public</w:t>
-            </w:r>
-            <w:r>
-              <w:rPr>
-                <w:rFonts w:ascii="Consolas" w:eastAsiaTheme="minorEastAsia" w:hAnsi="Consolas" w:cs="Consolas"/>
-                <w:color w:val="000000"/>
-                <w:sz w:val="20"/>
-              </w:rPr>
-              <w:t xml:space="preserve"> </w:t>
-            </w:r>
-            <w:r>
-              <w:rPr>
-                <w:rFonts w:ascii="Consolas" w:eastAsiaTheme="minorEastAsia" w:hAnsi="Consolas" w:cs="Consolas"/>
-                <w:b/>
-                <w:bCs/>
-                <w:color w:val="7F0055"/>
-                <w:sz w:val="20"/>
-              </w:rPr>
-              <w:t>class</w:t>
-            </w:r>
-            <w:r>
-              <w:rPr>
-                <w:rFonts w:ascii="Consolas" w:eastAsiaTheme="minorEastAsia" w:hAnsi="Consolas" w:cs="Consolas"/>
-                <w:color w:val="000000"/>
-                <w:sz w:val="20"/>
-              </w:rPr>
-              <w:t xml:space="preserve"> </w:t>
-            </w:r>
-            <w:proofErr w:type="spellStart"/>
-            <w:r>
-              <w:rPr>
-                <w:rFonts w:ascii="Consolas" w:eastAsiaTheme="minorEastAsia" w:hAnsi="Consolas" w:cs="Consolas"/>
-                <w:color w:val="000000"/>
-                <w:sz w:val="20"/>
-              </w:rPr>
-              <w:t>FirstProgram</w:t>
-            </w:r>
-            <w:proofErr w:type="spellEnd"/>
-            <w:r>
-              <w:rPr>
-                <w:rFonts w:ascii="Consolas" w:eastAsiaTheme="minorEastAsia" w:hAnsi="Consolas" w:cs="Consolas"/>
-                <w:color w:val="000000"/>
-                <w:sz w:val="20"/>
-              </w:rPr>
-              <w:t xml:space="preserve"> {</w:t>
-            </w:r>
+                <w:rFonts w:ascii="Consolas" w:hAnsi="Consolas" w:hint="eastAsia"/>
+              </w:rPr>
+            </w:pPr>
           </w:p>
           <w:p>
             <w:pPr>
@@ -490,11 +223,63 @@
               <w:adjustRightInd w:val="0"/>
               <w:spacing w:after="0" w:line="240" w:lineRule="auto"/>
               <w:rPr>
-                <w:rFonts w:ascii="Consolas" w:eastAsiaTheme="minorEastAsia" w:hAnsi="Consolas" w:cs="Consolas"/>
-                <w:color w:val="auto"/>
-                <w:sz w:val="20"/>
-              </w:rPr>
-            </w:pPr>
+                <w:rFonts w:ascii="Consolas" w:hAnsi="Consolas" w:hint="eastAsia"/>
+              </w:rPr>
+            </w:pPr>
+            <w:r>
+              <w:rPr>
+                <w:rFonts w:ascii="Consolas" w:hAnsi="Consolas" w:hint="eastAsia"/>
+              </w:rPr>
+              <w:t>최종</w:t>
+            </w:r>
+            <w:r>
+              <w:rPr>
+                <w:rFonts w:ascii="Consolas" w:hAnsi="Consolas" w:hint="eastAsia"/>
+              </w:rPr>
+              <w:t xml:space="preserve"> </w:t>
+            </w:r>
+            <w:r>
+              <w:rPr>
+                <w:rFonts w:ascii="Consolas" w:hAnsi="Consolas" w:hint="eastAsia"/>
+              </w:rPr>
+              <w:t>소스</w:t>
+            </w:r>
+            <w:r>
+              <w:rPr>
+                <w:rFonts w:ascii="Consolas" w:hAnsi="Consolas" w:hint="eastAsia"/>
+              </w:rPr>
+              <w:t xml:space="preserve"> </w:t>
+            </w:r>
+            <w:r>
+              <w:rPr>
+                <w:rFonts w:ascii="Consolas" w:hAnsi="Consolas" w:hint="eastAsia"/>
+              </w:rPr>
+              <w:t>코드</w:t>
+            </w:r>
+            <w:r>
+              <w:rPr>
+                <w:rFonts w:ascii="Consolas" w:hAnsi="Consolas" w:hint="eastAsia"/>
+              </w:rPr>
+              <w:t xml:space="preserve"> (</w:t>
+            </w:r>
+            <w:r>
+              <w:rPr>
+                <w:rFonts w:ascii="Consolas" w:hAnsi="Consolas" w:hint="eastAsia"/>
+              </w:rPr>
+              <w:t>제출파일</w:t>
+            </w:r>
+            <w:r>
+              <w:rPr>
+                <w:rFonts w:ascii="Consolas" w:hAnsi="Consolas" w:hint="eastAsia"/>
+              </w:rPr>
+              <w:t xml:space="preserve"> copy &amp; past)</w:t>
+            </w:r>
+            <w:r>
+              <w:rPr>
+                <w:rFonts w:ascii="Consolas" w:hAnsi="Consolas" w:hint="eastAsia"/>
+              </w:rPr>
+              <w:t>하기</w:t>
+            </w:r>
           </w:p>
           <w:p>
             <w:pPr>
@@ -507,20 +292,52 @@
                 <w:rFonts w:ascii="Consolas" w:hAnsi="Consolas"/>
               </w:rPr>
             </w:pPr>
-            <w:r>
-              <w:rPr>
-                <w:rFonts w:ascii="Consolas" w:eastAsiaTheme="minorEastAsia" w:hAnsi="Consolas" w:cs="Consolas"/>
-                <w:color w:val="000000"/>
-                <w:sz w:val="20"/>
-              </w:rPr>
-              <w:tab/>
-            </w:r>
-          </w:p>
-          <w:p>
-            <w:pPr>
-              <w:spacing w:after="20" w:line="240" w:lineRule="auto"/>
+          </w:p>
+          <w:p>
+            <w:pPr>
+              <w:widowControl w:val="0"/>
+              <w:autoSpaceDE w:val="0"/>
+              <w:autoSpaceDN w:val="0"/>
+              <w:adjustRightInd w:val="0"/>
+              <w:spacing w:after="0" w:line="240" w:lineRule="auto"/>
               <w:rPr>
                 <w:rFonts w:ascii="Consolas" w:hAnsi="Consolas"/>
+              </w:rPr>
+            </w:pPr>
+          </w:p>
+          <w:p>
+            <w:pPr>
+              <w:widowControl w:val="0"/>
+              <w:autoSpaceDE w:val="0"/>
+              <w:autoSpaceDN w:val="0"/>
+              <w:adjustRightInd w:val="0"/>
+              <w:spacing w:after="0" w:line="240" w:lineRule="auto"/>
+              <w:rPr>
+                <w:rFonts w:ascii="Consolas" w:hAnsi="Consolas"/>
+              </w:rPr>
+            </w:pPr>
+          </w:p>
+          <w:p>
+            <w:pPr>
+              <w:widowControl w:val="0"/>
+              <w:autoSpaceDE w:val="0"/>
+              <w:autoSpaceDN w:val="0"/>
+              <w:adjustRightInd w:val="0"/>
+              <w:spacing w:after="0" w:line="240" w:lineRule="auto"/>
+              <w:rPr>
+                <w:rFonts w:ascii="Consolas" w:hAnsi="Consolas"/>
+              </w:rPr>
+            </w:pPr>
+          </w:p>
+          <w:p>
+            <w:pPr>
+              <w:widowControl w:val="0"/>
+              <w:autoSpaceDE w:val="0"/>
+              <w:autoSpaceDN w:val="0"/>
+              <w:adjustRightInd w:val="0"/>
+              <w:spacing w:after="0" w:line="240" w:lineRule="auto"/>
+              <w:rPr>
+                <w:rFonts w:ascii="Consolas" w:hAnsi="Consolas" w:hint="eastAsia"/>
               </w:rPr>
             </w:pPr>
           </w:p>
@@ -654,39 +471,53 @@
                 <w:sz w:val="20"/>
               </w:rPr>
             </w:pPr>
-          </w:p>
-          <w:p>
-            <w:pPr>
-              <w:spacing w:after="0" w:line="240" w:lineRule="auto"/>
-              <w:rPr>
-                <w:rFonts w:ascii="Arial" w:hAnsi="Arial" w:cs="Arial"/>
-                <w:sz w:val="20"/>
-              </w:rPr>
-            </w:pPr>
-          </w:p>
-          <w:p>
-            <w:pPr>
-              <w:spacing w:after="0" w:line="240" w:lineRule="auto"/>
-              <w:rPr>
-                <w:rFonts w:ascii="Arial" w:hAnsi="Arial" w:cs="Arial"/>
-                <w:sz w:val="20"/>
-              </w:rPr>
-            </w:pPr>
-          </w:p>
-          <w:p>
-            <w:pPr>
-              <w:spacing w:after="0" w:line="240" w:lineRule="auto"/>
-              <w:rPr>
-                <w:rFonts w:ascii="Arial" w:hAnsi="Arial" w:cs="Arial"/>
-                <w:sz w:val="20"/>
-              </w:rPr>
-            </w:pPr>
-          </w:p>
-          <w:p>
-            <w:pPr>
-              <w:spacing w:after="0" w:line="240" w:lineRule="auto"/>
-              <w:rPr>
-                <w:rFonts w:ascii="Arial" w:hAnsi="Arial" w:cs="Arial"/>
+            <w:r>
+              <w:rPr>
+                <w:rFonts w:ascii="Arial" w:hAnsi="Arial" w:cs="Arial"/>
+                <w:sz w:val="20"/>
+              </w:rPr>
+              <w:drawing>
+                <wp:inline distT="0" distB="0" distL="0" distR="0" wp14:anchorId="49C19428" wp14:editId="1D818570">
+                  <wp:extent cx="3324225" cy="2994668"/>
+                  <wp:effectExtent l="0" t="0" r="0" b="0"/>
+                  <wp:docPr id="240627110" name="그림 1"/>
+                  <wp:cNvGraphicFramePr>
+                    <a:graphicFrameLocks xmlns:a="http://schemas.openxmlformats.org/drawingml/2006/main" noChangeAspect="1"/>
+                  </wp:cNvGraphicFramePr>
+                  <a:graphic xmlns:a="http://schemas.openxmlformats.org/drawingml/2006/main">
+                    <a:graphicData uri="http://schemas.openxmlformats.org/drawingml/2006/picture">
+                      <pic:pic xmlns:pic="http://schemas.openxmlformats.org/drawingml/2006/picture">
+                        <pic:nvPicPr>
+                          <pic:cNvPr id="240627110" name=""/>
+                          <pic:cNvPicPr/>
+                        </pic:nvPicPr>
+                        <pic:blipFill>
+                          <a:blip r:embed="rId8"/>
+                          <a:stretch>
+                            <a:fillRect/>
+                          </a:stretch>
+                        </pic:blipFill>
+                        <pic:spPr>
+                          <a:xfrm>
+                            <a:off x="0" y="0"/>
+                            <a:ext cx="3327874" cy="2997955"/>
+                          </a:xfrm>
+                          <a:prstGeom prst="rect">
+                            <a:avLst/>
+                          </a:prstGeom>
+                        </pic:spPr>
+                      </pic:pic>
+                    </a:graphicData>
+                  </a:graphic>
+                </wp:inline>
+              </w:drawing>
+            </w:r>
+          </w:p>
+          <w:p>
+            <w:pPr>
+              <w:spacing w:after="0" w:line="240" w:lineRule="auto"/>
+              <w:rPr>
+                <w:rFonts w:ascii="Arial" w:hAnsi="Arial" w:cs="Arial" w:hint="eastAsia"/>
                 <w:b w:val="0"/>
                 <w:bCs w:val="0"/>
                 <w:sz w:val="20"/>
@@ -694,11 +525,47 @@
             </w:pPr>
             <w:r>
               <w:rPr>
+                <w:rFonts w:ascii="Arial" w:hAnsi="Arial" w:cs="Arial"/>
                 <w:b w:val="0"/>
                 <w:bCs w:val="0"/>
-                <w:color w:val="FF0000"/>
-              </w:rPr>
-              <w:br/>
+                <w:sz w:val="20"/>
+              </w:rPr>
+              <w:lastRenderedPageBreak/>
+              <w:drawing>
+                <wp:inline distT="0" distB="0" distL="0" distR="0" wp14:anchorId="7C609059" wp14:editId="79A15675">
+                  <wp:extent cx="3724275" cy="1737940"/>
+                  <wp:effectExtent l="0" t="0" r="0" b="0"/>
+                  <wp:docPr id="76474606" name="그림 1"/>
+                  <wp:cNvGraphicFramePr>
+                    <a:graphicFrameLocks xmlns:a="http://schemas.openxmlformats.org/drawingml/2006/main" noChangeAspect="1"/>
+                  </wp:cNvGraphicFramePr>
+                  <a:graphic xmlns:a="http://schemas.openxmlformats.org/drawingml/2006/main">
+                    <a:graphicData uri="http://schemas.openxmlformats.org/drawingml/2006/picture">
+                      <pic:pic xmlns:pic="http://schemas.openxmlformats.org/drawingml/2006/picture">
+                        <pic:nvPicPr>
+                          <pic:cNvPr id="76474606" name=""/>
+                          <pic:cNvPicPr/>
+                        </pic:nvPicPr>
+                        <pic:blipFill>
+                          <a:blip r:embed="rId9"/>
+                          <a:stretch>
+                            <a:fillRect/>
+                          </a:stretch>
+                        </pic:blipFill>
+                        <pic:spPr>
+                          <a:xfrm>
+                            <a:off x="0" y="0"/>
+                            <a:ext cx="3765300" cy="1757084"/>
+                          </a:xfrm>
+                          <a:prstGeom prst="rect">
+                            <a:avLst/>
+                          </a:prstGeom>
+                        </pic:spPr>
+                      </pic:pic>
+                    </a:graphicData>
+                  </a:graphic>
+                </wp:inline>
+              </w:drawing>
             </w:r>
           </w:p>
         </w:tc>
@@ -708,14 +575,13 @@
       <w:pPr>
         <w:pStyle w:val="2"/>
       </w:pPr>
-      <w:proofErr w:type="spellStart"/>
       <w:r>
         <w:rPr>
           <w:rFonts w:hint="eastAsia"/>
         </w:rPr>
+        <w:lastRenderedPageBreak/>
         <w:t>Github</w:t>
       </w:r>
-      <w:proofErr w:type="spellEnd"/>
       <w:r>
         <w:t xml:space="preserve"> (Screen Shots)</w:t>
       </w:r>
@@ -773,7 +639,7 @@
               <w:jc w:val="both"/>
               <w:cnfStyle w:val="100000000000" w:firstRow="1" w:lastRow="0" w:firstColumn="0" w:lastColumn="0" w:oddVBand="0" w:evenVBand="0" w:oddHBand="0" w:evenHBand="0" w:firstRowFirstColumn="0" w:firstRowLastColumn="0" w:lastRowFirstColumn="0" w:lastRowLastColumn="0"/>
               <w:rPr>
-                <w:rFonts w:ascii="Arial" w:hAnsi="Arial" w:cs="Arial" w:hint="eastAsia"/>
+                <w:rFonts w:ascii="Arial" w:hAnsi="Arial" w:cs="Arial"/>
                 <w:b w:val="0"/>
                 <w:sz w:val="20"/>
               </w:rPr>
@@ -792,18 +658,8 @@
                 <w:b w:val="0"/>
                 <w:sz w:val="20"/>
               </w:rPr>
-              <w:t xml:space="preserve"> </w:t>
-            </w:r>
-            <w:proofErr w:type="spellStart"/>
-            <w:r>
-              <w:rPr>
-                <w:rFonts w:ascii="Arial" w:hAnsi="Arial" w:cs="Arial" w:hint="eastAsia"/>
-                <w:b w:val="0"/>
-                <w:sz w:val="20"/>
-              </w:rPr>
-              <w:t>Github</w:t>
-            </w:r>
-            <w:proofErr w:type="spellEnd"/>
+              <w:t xml:space="preserve"> Github</w:t>
+            </w:r>
             <w:r>
               <w:rPr>
                 <w:rFonts w:ascii="Arial" w:hAnsi="Arial" w:cs="Arial" w:hint="eastAsia"/>
@@ -962,68 +818,70 @@
                 <w:sz w:val="20"/>
               </w:rPr>
             </w:pPr>
-          </w:p>
-          <w:p>
-            <w:pPr>
-              <w:spacing w:after="0" w:line="240" w:lineRule="auto"/>
-              <w:rPr>
-                <w:rFonts w:ascii="Arial" w:hAnsi="Arial" w:cs="Arial"/>
-                <w:sz w:val="20"/>
-              </w:rPr>
-            </w:pPr>
-          </w:p>
-          <w:p>
-            <w:pPr>
-              <w:spacing w:after="0" w:line="240" w:lineRule="auto"/>
-              <w:rPr>
-                <w:rFonts w:ascii="Arial" w:hAnsi="Arial" w:cs="Arial"/>
-                <w:sz w:val="20"/>
-              </w:rPr>
-            </w:pPr>
-          </w:p>
-          <w:p>
-            <w:pPr>
-              <w:spacing w:after="0" w:line="240" w:lineRule="auto"/>
-              <w:rPr>
-                <w:rFonts w:ascii="Arial" w:hAnsi="Arial" w:cs="Arial"/>
+            <w:r>
+              <w:rPr>
+                <w:rFonts w:ascii="Arial" w:hAnsi="Arial" w:cs="Arial"/>
+                <w:sz w:val="20"/>
+              </w:rPr>
+              <w:drawing>
+                <wp:inline distT="0" distB="0" distL="0" distR="0" wp14:anchorId="02381538" wp14:editId="5201819A">
+                  <wp:extent cx="4791075" cy="5792179"/>
+                  <wp:effectExtent l="0" t="0" r="0" b="0"/>
+                  <wp:docPr id="1597808672" name="그림 1"/>
+                  <wp:cNvGraphicFramePr>
+                    <a:graphicFrameLocks xmlns:a="http://schemas.openxmlformats.org/drawingml/2006/main" noChangeAspect="1"/>
+                  </wp:cNvGraphicFramePr>
+                  <a:graphic xmlns:a="http://schemas.openxmlformats.org/drawingml/2006/main">
+                    <a:graphicData uri="http://schemas.openxmlformats.org/drawingml/2006/picture">
+                      <pic:pic xmlns:pic="http://schemas.openxmlformats.org/drawingml/2006/picture">
+                        <pic:nvPicPr>
+                          <pic:cNvPr id="1597808672" name=""/>
+                          <pic:cNvPicPr/>
+                        </pic:nvPicPr>
+                        <pic:blipFill>
+                          <a:blip r:embed="rId10"/>
+                          <a:stretch>
+                            <a:fillRect/>
+                          </a:stretch>
+                        </pic:blipFill>
+                        <pic:spPr>
+                          <a:xfrm>
+                            <a:off x="0" y="0"/>
+                            <a:ext cx="4801002" cy="5804180"/>
+                          </a:xfrm>
+                          <a:prstGeom prst="rect">
+                            <a:avLst/>
+                          </a:prstGeom>
+                        </pic:spPr>
+                      </pic:pic>
+                    </a:graphicData>
+                  </a:graphic>
+                </wp:inline>
+              </w:drawing>
+            </w:r>
+          </w:p>
+          <w:p>
+            <w:pPr>
+              <w:spacing w:after="0" w:line="240" w:lineRule="auto"/>
+              <w:rPr>
+                <w:rFonts w:ascii="Arial" w:hAnsi="Arial" w:cs="Arial" w:hint="eastAsia"/>
                 <w:b w:val="0"/>
                 <w:bCs w:val="0"/>
                 <w:sz w:val="20"/>
               </w:rPr>
             </w:pPr>
-            <w:r>
-              <w:rPr>
-                <w:b w:val="0"/>
-                <w:bCs w:val="0"/>
-                <w:color w:val="FF0000"/>
-              </w:rPr>
-              <w:br/>
-            </w:r>
           </w:p>
         </w:tc>
       </w:tr>
     </w:tbl>
     <w:p>
       <w:pPr>
-        <w:spacing w:after="160" w:line="259" w:lineRule="auto"/>
-        <w:jc w:val="both"/>
-        <w:rPr>
-          <w:b/>
-          <w:bCs/>
-          <w:caps/>
-          <w:color w:val="1F4E79" w:themeColor="accent1" w:themeShade="80"/>
-          <w:sz w:val="28"/>
-        </w:rPr>
+        <w:pStyle w:val="1"/>
+        <w:spacing w:before="360" w:after="120"/>
       </w:pPr>
       <w:r>
         <w:br w:type="page"/>
       </w:r>
-    </w:p>
-    <w:p>
-      <w:pPr>
-        <w:pStyle w:val="1"/>
-        <w:spacing w:before="360" w:after="120"/>
-      </w:pPr>
       <w:r>
         <w:rPr>
           <w:rFonts w:hint="eastAsia"/>
@@ -1083,165 +941,9 @@
               <w:adjustRightInd w:val="0"/>
               <w:spacing w:after="0" w:line="240" w:lineRule="auto"/>
               <w:rPr>
-                <w:rFonts w:ascii="Consolas" w:eastAsiaTheme="minorEastAsia" w:hAnsi="Consolas" w:cs="Consolas"/>
-                <w:b/>
-                <w:bCs/>
-                <w:color w:val="7F0055"/>
-                <w:sz w:val="20"/>
-              </w:rPr>
-            </w:pPr>
-            <w:proofErr w:type="gramStart"/>
-            <w:r>
-              <w:rPr>
-                <w:rFonts w:ascii="Consolas" w:eastAsiaTheme="minorEastAsia" w:hAnsi="Consolas" w:cs="Consolas" w:hint="eastAsia"/>
-                <w:b/>
-                <w:bCs/>
-                <w:color w:val="7F0055"/>
-                <w:sz w:val="20"/>
-              </w:rPr>
-              <w:t xml:space="preserve">// </w:t>
-            </w:r>
-            <w:r>
-              <w:rPr>
-                <w:rFonts w:ascii="Consolas" w:eastAsiaTheme="minorEastAsia" w:hAnsi="Consolas" w:cs="Consolas" w:hint="eastAsia"/>
-                <w:b/>
-                <w:bCs/>
-                <w:color w:val="7F0055"/>
-                <w:sz w:val="20"/>
-              </w:rPr>
-              <w:t>아래</w:t>
-            </w:r>
-            <w:proofErr w:type="gramEnd"/>
-            <w:r>
-              <w:rPr>
-                <w:rFonts w:ascii="Consolas" w:eastAsiaTheme="minorEastAsia" w:hAnsi="Consolas" w:cs="Consolas" w:hint="eastAsia"/>
-                <w:b/>
-                <w:bCs/>
-                <w:color w:val="7F0055"/>
-                <w:sz w:val="20"/>
-              </w:rPr>
-              <w:t xml:space="preserve"> </w:t>
-            </w:r>
-            <w:r>
-              <w:rPr>
-                <w:rFonts w:ascii="Consolas" w:eastAsiaTheme="minorEastAsia" w:hAnsi="Consolas" w:cs="Consolas" w:hint="eastAsia"/>
-                <w:b/>
-                <w:bCs/>
-                <w:color w:val="7F0055"/>
-                <w:sz w:val="20"/>
-              </w:rPr>
-              <w:t>내용</w:t>
-            </w:r>
-            <w:r>
-              <w:rPr>
-                <w:rFonts w:ascii="Consolas" w:eastAsiaTheme="minorEastAsia" w:hAnsi="Consolas" w:cs="Consolas" w:hint="eastAsia"/>
-                <w:b/>
-                <w:bCs/>
-                <w:color w:val="7F0055"/>
-                <w:sz w:val="20"/>
-              </w:rPr>
-              <w:t xml:space="preserve"> </w:t>
-            </w:r>
-            <w:r>
-              <w:rPr>
-                <w:rFonts w:ascii="Consolas" w:eastAsiaTheme="minorEastAsia" w:hAnsi="Consolas" w:cs="Consolas" w:hint="eastAsia"/>
-                <w:b/>
-                <w:bCs/>
-                <w:color w:val="7F0055"/>
-                <w:sz w:val="20"/>
-              </w:rPr>
-              <w:t>삭제</w:t>
-            </w:r>
-            <w:r>
-              <w:rPr>
-                <w:rFonts w:ascii="Consolas" w:eastAsiaTheme="minorEastAsia" w:hAnsi="Consolas" w:cs="Consolas" w:hint="eastAsia"/>
-                <w:b/>
-                <w:bCs/>
-                <w:color w:val="7F0055"/>
-                <w:sz w:val="20"/>
-              </w:rPr>
-              <w:t xml:space="preserve"> </w:t>
-            </w:r>
-            <w:r>
-              <w:rPr>
-                <w:rFonts w:ascii="Consolas" w:eastAsiaTheme="minorEastAsia" w:hAnsi="Consolas" w:cs="Consolas" w:hint="eastAsia"/>
-                <w:b/>
-                <w:bCs/>
-                <w:color w:val="7F0055"/>
-                <w:sz w:val="20"/>
-              </w:rPr>
-              <w:t>후</w:t>
-            </w:r>
-            <w:r>
-              <w:rPr>
-                <w:rFonts w:ascii="Consolas" w:eastAsiaTheme="minorEastAsia" w:hAnsi="Consolas" w:cs="Consolas" w:hint="eastAsia"/>
-                <w:b/>
-                <w:bCs/>
-                <w:color w:val="7F0055"/>
-                <w:sz w:val="20"/>
-              </w:rPr>
-              <w:t xml:space="preserve"> </w:t>
-            </w:r>
-            <w:r>
-              <w:rPr>
-                <w:rFonts w:ascii="Consolas" w:eastAsiaTheme="minorEastAsia" w:hAnsi="Consolas" w:cs="Consolas" w:hint="eastAsia"/>
-                <w:b/>
-                <w:bCs/>
-                <w:color w:val="7F0055"/>
-                <w:sz w:val="20"/>
-              </w:rPr>
-              <w:t>본인</w:t>
-            </w:r>
-            <w:r>
-              <w:rPr>
-                <w:rFonts w:ascii="Consolas" w:eastAsiaTheme="minorEastAsia" w:hAnsi="Consolas" w:cs="Consolas" w:hint="eastAsia"/>
-                <w:b/>
-                <w:bCs/>
-                <w:color w:val="7F0055"/>
-                <w:sz w:val="20"/>
-              </w:rPr>
-              <w:t xml:space="preserve"> </w:t>
-            </w:r>
-            <w:r>
-              <w:rPr>
-                <w:rFonts w:ascii="Consolas" w:eastAsiaTheme="minorEastAsia" w:hAnsi="Consolas" w:cs="Consolas" w:hint="eastAsia"/>
-                <w:b/>
-                <w:bCs/>
-                <w:color w:val="7F0055"/>
-                <w:sz w:val="20"/>
-              </w:rPr>
-              <w:t>코드로</w:t>
-            </w:r>
-            <w:r>
-              <w:rPr>
-                <w:rFonts w:ascii="Consolas" w:eastAsiaTheme="minorEastAsia" w:hAnsi="Consolas" w:cs="Consolas" w:hint="eastAsia"/>
-                <w:b/>
-                <w:bCs/>
-                <w:color w:val="7F0055"/>
-                <w:sz w:val="20"/>
-              </w:rPr>
-              <w:t xml:space="preserve"> </w:t>
-            </w:r>
-            <w:r>
-              <w:rPr>
-                <w:rFonts w:ascii="Consolas" w:eastAsiaTheme="minorEastAsia" w:hAnsi="Consolas" w:cs="Consolas" w:hint="eastAsia"/>
-                <w:b/>
-                <w:bCs/>
-                <w:color w:val="7F0055"/>
-                <w:sz w:val="20"/>
-              </w:rPr>
-              <w:t>대체</w:t>
-            </w:r>
-            <w:r>
-              <w:rPr>
-                <w:rFonts w:ascii="Consolas" w:eastAsiaTheme="minorEastAsia" w:hAnsi="Consolas" w:cs="Consolas" w:hint="eastAsia"/>
-                <w:b/>
-                <w:bCs/>
-                <w:color w:val="7F0055"/>
-                <w:sz w:val="20"/>
-              </w:rPr>
-              <w:t xml:space="preserve"> </w:t>
-            </w:r>
+                <w:rFonts w:ascii="Consolas" w:hAnsi="Consolas"/>
+              </w:rPr>
+            </w:pPr>
           </w:p>
           <w:p>
             <w:pPr>
@@ -1251,11 +953,7 @@
               <w:adjustRightInd w:val="0"/>
               <w:spacing w:after="0" w:line="240" w:lineRule="auto"/>
               <w:rPr>
-                <w:rFonts w:ascii="Consolas" w:eastAsiaTheme="minorEastAsia" w:hAnsi="Consolas" w:cs="Consolas"/>
-                <w:b/>
-                <w:bCs/>
-                <w:color w:val="7F0055"/>
-                <w:sz w:val="20"/>
+                <w:rFonts w:ascii="Consolas" w:hAnsi="Consolas"/>
               </w:rPr>
             </w:pPr>
           </w:p>
@@ -1267,153 +965,63 @@
               <w:adjustRightInd w:val="0"/>
               <w:spacing w:after="0" w:line="240" w:lineRule="auto"/>
               <w:rPr>
-                <w:rFonts w:ascii="Consolas" w:eastAsiaTheme="minorEastAsia" w:hAnsi="Consolas" w:cs="Consolas"/>
-                <w:color w:val="auto"/>
-                <w:sz w:val="20"/>
-              </w:rPr>
-            </w:pPr>
-            <w:r>
-              <w:rPr>
-                <w:rFonts w:ascii="Consolas" w:eastAsiaTheme="minorEastAsia" w:hAnsi="Consolas" w:cs="Consolas"/>
-                <w:b/>
-                <w:bCs/>
-                <w:color w:val="7F0055"/>
-                <w:sz w:val="20"/>
-              </w:rPr>
-              <w:t>import</w:t>
-            </w:r>
-            <w:r>
-              <w:rPr>
-                <w:rFonts w:ascii="Consolas" w:eastAsiaTheme="minorEastAsia" w:hAnsi="Consolas" w:cs="Consolas"/>
-                <w:color w:val="000000"/>
-                <w:sz w:val="20"/>
+                <w:rFonts w:ascii="Consolas" w:hAnsi="Consolas" w:hint="eastAsia"/>
+              </w:rPr>
+            </w:pPr>
+            <w:r>
+              <w:rPr>
+                <w:rFonts w:ascii="Consolas" w:hAnsi="Consolas" w:hint="eastAsia"/>
+              </w:rPr>
+              <w:t>최종</w:t>
+            </w:r>
+            <w:r>
+              <w:rPr>
+                <w:rFonts w:ascii="Consolas" w:hAnsi="Consolas" w:hint="eastAsia"/>
               </w:rPr>
               <w:t xml:space="preserve"> </w:t>
             </w:r>
-            <w:proofErr w:type="spellStart"/>
-            <w:proofErr w:type="gramStart"/>
-            <w:r>
-              <w:rPr>
-                <w:rFonts w:ascii="Consolas" w:eastAsiaTheme="minorEastAsia" w:hAnsi="Consolas" w:cs="Consolas"/>
-                <w:color w:val="000000"/>
-                <w:sz w:val="20"/>
-              </w:rPr>
-              <w:t>java.util</w:t>
-            </w:r>
-            <w:proofErr w:type="gramEnd"/>
-            <w:r>
-              <w:rPr>
-                <w:rFonts w:ascii="Consolas" w:eastAsiaTheme="minorEastAsia" w:hAnsi="Consolas" w:cs="Consolas"/>
-                <w:color w:val="000000"/>
-                <w:sz w:val="20"/>
-              </w:rPr>
-              <w:t>.Scanner</w:t>
-            </w:r>
-            <w:proofErr w:type="spellEnd"/>
-            <w:r>
-              <w:rPr>
-                <w:rFonts w:ascii="Consolas" w:eastAsiaTheme="minorEastAsia" w:hAnsi="Consolas" w:cs="Consolas"/>
-                <w:color w:val="000000"/>
-                <w:sz w:val="20"/>
-              </w:rPr>
-              <w:t>;</w:t>
-            </w:r>
-          </w:p>
-          <w:p>
-            <w:pPr>
-              <w:widowControl w:val="0"/>
-              <w:autoSpaceDE w:val="0"/>
-              <w:autoSpaceDN w:val="0"/>
-              <w:adjustRightInd w:val="0"/>
-              <w:spacing w:after="0" w:line="240" w:lineRule="auto"/>
-              <w:rPr>
-                <w:rFonts w:ascii="Consolas" w:eastAsiaTheme="minorEastAsia" w:hAnsi="Consolas" w:cs="Consolas"/>
-                <w:color w:val="auto"/>
-                <w:sz w:val="20"/>
-              </w:rPr>
-            </w:pPr>
-          </w:p>
-          <w:p>
-            <w:pPr>
-              <w:widowControl w:val="0"/>
-              <w:autoSpaceDE w:val="0"/>
-              <w:autoSpaceDN w:val="0"/>
-              <w:adjustRightInd w:val="0"/>
-              <w:spacing w:after="0" w:line="240" w:lineRule="auto"/>
-              <w:rPr>
-                <w:rFonts w:ascii="Consolas" w:eastAsiaTheme="minorEastAsia" w:hAnsi="Consolas" w:cs="Consolas"/>
-                <w:color w:val="auto"/>
-                <w:sz w:val="20"/>
-              </w:rPr>
-            </w:pPr>
-            <w:r>
-              <w:rPr>
-                <w:rFonts w:ascii="Consolas" w:eastAsiaTheme="minorEastAsia" w:hAnsi="Consolas" w:cs="Consolas"/>
-                <w:b/>
-                <w:bCs/>
-                <w:color w:val="7F0055"/>
-                <w:sz w:val="20"/>
-              </w:rPr>
-              <w:t>public</w:t>
-            </w:r>
-            <w:r>
-              <w:rPr>
-                <w:rFonts w:ascii="Consolas" w:eastAsiaTheme="minorEastAsia" w:hAnsi="Consolas" w:cs="Consolas"/>
-                <w:color w:val="000000"/>
-                <w:sz w:val="20"/>
+            <w:r>
+              <w:rPr>
+                <w:rFonts w:ascii="Consolas" w:hAnsi="Consolas" w:hint="eastAsia"/>
+              </w:rPr>
+              <w:t>소스</w:t>
+            </w:r>
+            <w:r>
+              <w:rPr>
+                <w:rFonts w:ascii="Consolas" w:hAnsi="Consolas" w:hint="eastAsia"/>
               </w:rPr>
               <w:t xml:space="preserve"> </w:t>
             </w:r>
             <w:r>
               <w:rPr>
-                <w:rFonts w:ascii="Consolas" w:eastAsiaTheme="minorEastAsia" w:hAnsi="Consolas" w:cs="Consolas"/>
-                <w:b/>
-                <w:bCs/>
-                <w:color w:val="7F0055"/>
-                <w:sz w:val="20"/>
-              </w:rPr>
-              <w:t>class</w:t>
-            </w:r>
-            <w:r>
-              <w:rPr>
-                <w:rFonts w:ascii="Consolas" w:eastAsiaTheme="minorEastAsia" w:hAnsi="Consolas" w:cs="Consolas"/>
-                <w:color w:val="000000"/>
-                <w:sz w:val="20"/>
-              </w:rPr>
-              <w:t xml:space="preserve"> </w:t>
-            </w:r>
-            <w:proofErr w:type="spellStart"/>
-            <w:r>
-              <w:rPr>
-                <w:rFonts w:ascii="Consolas" w:eastAsiaTheme="minorEastAsia" w:hAnsi="Consolas" w:cs="Consolas"/>
-                <w:color w:val="000000"/>
-                <w:sz w:val="20"/>
-              </w:rPr>
-              <w:t>FirstProgram</w:t>
-            </w:r>
-            <w:proofErr w:type="spellEnd"/>
-            <w:r>
-              <w:rPr>
-                <w:rFonts w:ascii="Consolas" w:eastAsiaTheme="minorEastAsia" w:hAnsi="Consolas" w:cs="Consolas"/>
-                <w:color w:val="000000"/>
-                <w:sz w:val="20"/>
-              </w:rPr>
-              <w:t xml:space="preserve"> {</w:t>
-            </w:r>
-          </w:p>
-          <w:p>
-            <w:pPr>
-              <w:widowControl w:val="0"/>
-              <w:autoSpaceDE w:val="0"/>
-              <w:autoSpaceDN w:val="0"/>
-              <w:adjustRightInd w:val="0"/>
-              <w:spacing w:after="0" w:line="240" w:lineRule="auto"/>
-              <w:rPr>
-                <w:rFonts w:ascii="Consolas" w:eastAsiaTheme="minorEastAsia" w:hAnsi="Consolas" w:cs="Consolas"/>
-                <w:color w:val="auto"/>
-                <w:sz w:val="20"/>
-              </w:rPr>
-            </w:pPr>
+                <w:rFonts w:ascii="Consolas" w:hAnsi="Consolas" w:hint="eastAsia"/>
+              </w:rPr>
+              <w:t>코드</w:t>
+            </w:r>
+            <w:r>
+              <w:rPr>
+                <w:rFonts w:ascii="Consolas" w:hAnsi="Consolas" w:hint="eastAsia"/>
+              </w:rPr>
+              <w:t xml:space="preserve"> (</w:t>
+            </w:r>
+            <w:r>
+              <w:rPr>
+                <w:rFonts w:ascii="Consolas" w:hAnsi="Consolas" w:hint="eastAsia"/>
+              </w:rPr>
+              <w:t>제출파일</w:t>
+            </w:r>
+            <w:r>
+              <w:rPr>
+                <w:rFonts w:ascii="Consolas" w:hAnsi="Consolas" w:hint="eastAsia"/>
+              </w:rPr>
+              <w:t xml:space="preserve"> copy &amp; past)</w:t>
+            </w:r>
+            <w:r>
+              <w:rPr>
+                <w:rFonts w:ascii="Consolas" w:hAnsi="Consolas" w:hint="eastAsia"/>
+              </w:rPr>
+              <w:t>하기</w:t>
+            </w:r>
           </w:p>
           <w:p>
             <w:pPr>
@@ -1461,8 +1069,8 @@
         <w:tblLook w:val="04A0" w:firstRow="1" w:lastRow="0" w:firstColumn="1" w:lastColumn="0" w:noHBand="0" w:noVBand="1"/>
       </w:tblPr>
       <w:tblGrid>
-        <w:gridCol w:w="439"/>
-        <w:gridCol w:w="8577"/>
+        <w:gridCol w:w="787"/>
+        <w:gridCol w:w="8229"/>
       </w:tblGrid>
       <w:tr>
         <w:trPr>
@@ -1481,7 +1089,7 @@
               <w:spacing w:after="0" w:line="240" w:lineRule="auto"/>
               <w:jc w:val="both"/>
               <w:rPr>
-                <w:rFonts w:ascii="Arial" w:hAnsi="Arial" w:cs="Arial" w:hint="eastAsia"/>
+                <w:rFonts w:ascii="Arial" w:hAnsi="Arial" w:cs="Arial"/>
                 <w:b w:val="0"/>
                 <w:sz w:val="20"/>
               </w:rPr>
@@ -1581,24 +1189,107 @@
                 <w:sz w:val="20"/>
               </w:rPr>
             </w:pPr>
-          </w:p>
-          <w:p>
-            <w:pPr>
-              <w:spacing w:after="0" w:line="240" w:lineRule="auto"/>
-              <w:rPr>
-                <w:rFonts w:ascii="Arial" w:hAnsi="Arial" w:cs="Arial"/>
-                <w:sz w:val="20"/>
-              </w:rPr>
-            </w:pPr>
-          </w:p>
-          <w:p>
-            <w:pPr>
-              <w:spacing w:after="0" w:line="240" w:lineRule="auto"/>
-              <w:rPr>
-                <w:rFonts w:ascii="Arial" w:hAnsi="Arial" w:cs="Arial"/>
-                <w:sz w:val="20"/>
-              </w:rPr>
-            </w:pPr>
+            <w:r>
+              <w:rPr>
+                <w:rFonts w:ascii="Arial" w:hAnsi="Arial" w:cs="Arial"/>
+                <w:sz w:val="20"/>
+              </w:rPr>
+              <w:drawing>
+                <wp:inline distT="0" distB="0" distL="0" distR="0" wp14:anchorId="347A5D12" wp14:editId="55515168">
+                  <wp:extent cx="4930567" cy="4801016"/>
+                  <wp:effectExtent l="0" t="0" r="3810" b="0"/>
+                  <wp:docPr id="1635121484" name="그림 1"/>
+                  <wp:cNvGraphicFramePr>
+                    <a:graphicFrameLocks xmlns:a="http://schemas.openxmlformats.org/drawingml/2006/main" noChangeAspect="1"/>
+                  </wp:cNvGraphicFramePr>
+                  <a:graphic xmlns:a="http://schemas.openxmlformats.org/drawingml/2006/main">
+                    <a:graphicData uri="http://schemas.openxmlformats.org/drawingml/2006/picture">
+                      <pic:pic xmlns:pic="http://schemas.openxmlformats.org/drawingml/2006/picture">
+                        <pic:nvPicPr>
+                          <pic:cNvPr id="1635121484" name=""/>
+                          <pic:cNvPicPr/>
+                        </pic:nvPicPr>
+                        <pic:blipFill>
+                          <a:blip r:embed="rId11"/>
+                          <a:stretch>
+                            <a:fillRect/>
+                          </a:stretch>
+                        </pic:blipFill>
+                        <pic:spPr>
+                          <a:xfrm>
+                            <a:off x="0" y="0"/>
+                            <a:ext cx="4930567" cy="4801016"/>
+                          </a:xfrm>
+                          <a:prstGeom prst="rect">
+                            <a:avLst/>
+                          </a:prstGeom>
+                        </pic:spPr>
+                      </pic:pic>
+                    </a:graphicData>
+                  </a:graphic>
+                </wp:inline>
+              </w:drawing>
+            </w:r>
+          </w:p>
+          <w:p>
+            <w:pPr>
+              <w:spacing w:after="0" w:line="240" w:lineRule="auto"/>
+              <w:rPr>
+                <w:rFonts w:ascii="Arial" w:hAnsi="Arial" w:cs="Arial"/>
+                <w:sz w:val="20"/>
+              </w:rPr>
+            </w:pPr>
+          </w:p>
+          <w:p>
+            <w:pPr>
+              <w:spacing w:after="0" w:line="240" w:lineRule="auto"/>
+              <w:rPr>
+                <w:rFonts w:ascii="Arial" w:hAnsi="Arial" w:cs="Arial"/>
+                <w:sz w:val="20"/>
+              </w:rPr>
+            </w:pPr>
+            <w:r>
+              <w:rPr>
+                <w:rFonts w:ascii="Arial" w:hAnsi="Arial" w:cs="Arial"/>
+                <w:sz w:val="20"/>
+              </w:rPr>
+              <w:lastRenderedPageBreak/>
+              <w:drawing>
+                <wp:inline distT="0" distB="0" distL="0" distR="0" wp14:anchorId="01F047D9" wp14:editId="1B7F6FCF">
+                  <wp:extent cx="3905250" cy="5662895"/>
+                  <wp:effectExtent l="0" t="0" r="0" b="0"/>
+                  <wp:docPr id="181227578" name="그림 1"/>
+                  <wp:cNvGraphicFramePr>
+                    <a:graphicFrameLocks xmlns:a="http://schemas.openxmlformats.org/drawingml/2006/main" noChangeAspect="1"/>
+                  </wp:cNvGraphicFramePr>
+                  <a:graphic xmlns:a="http://schemas.openxmlformats.org/drawingml/2006/main">
+                    <a:graphicData uri="http://schemas.openxmlformats.org/drawingml/2006/picture">
+                      <pic:pic xmlns:pic="http://schemas.openxmlformats.org/drawingml/2006/picture">
+                        <pic:nvPicPr>
+                          <pic:cNvPr id="181227578" name=""/>
+                          <pic:cNvPicPr/>
+                        </pic:nvPicPr>
+                        <pic:blipFill>
+                          <a:blip r:embed="rId12"/>
+                          <a:stretch>
+                            <a:fillRect/>
+                          </a:stretch>
+                        </pic:blipFill>
+                        <pic:spPr>
+                          <a:xfrm>
+                            <a:off x="0" y="0"/>
+                            <a:ext cx="3920533" cy="5685056"/>
+                          </a:xfrm>
+                          <a:prstGeom prst="rect">
+                            <a:avLst/>
+                          </a:prstGeom>
+                        </pic:spPr>
+                      </pic:pic>
+                    </a:graphicData>
+                  </a:graphic>
+                </wp:inline>
+              </w:drawing>
+            </w:r>
           </w:p>
           <w:p>
             <w:pPr>
@@ -1619,6 +1310,48 @@
                 <w:sz w:val="20"/>
               </w:rPr>
             </w:pPr>
+            <w:r>
+              <w:rPr>
+                <w:b w:val="0"/>
+                <w:bCs w:val="0"/>
+                <w:color w:val="FF0000"/>
+              </w:rPr>
+              <w:drawing>
+                <wp:inline distT="0" distB="0" distL="0" distR="0" wp14:anchorId="331D4E07" wp14:editId="06473EA2">
+                  <wp:extent cx="5731510" cy="2161540"/>
+                  <wp:effectExtent l="0" t="0" r="2540" b="0"/>
+                  <wp:docPr id="813577235" name="그림 1"/>
+                  <wp:cNvGraphicFramePr>
+                    <a:graphicFrameLocks xmlns:a="http://schemas.openxmlformats.org/drawingml/2006/main" noChangeAspect="1"/>
+                  </wp:cNvGraphicFramePr>
+                  <a:graphic xmlns:a="http://schemas.openxmlformats.org/drawingml/2006/main">
+                    <a:graphicData uri="http://schemas.openxmlformats.org/drawingml/2006/picture">
+                      <pic:pic xmlns:pic="http://schemas.openxmlformats.org/drawingml/2006/picture">
+                        <pic:nvPicPr>
+                          <pic:cNvPr id="813577235" name=""/>
+                          <pic:cNvPicPr/>
+                        </pic:nvPicPr>
+                        <pic:blipFill>
+                          <a:blip r:embed="rId13"/>
+                          <a:stretch>
+                            <a:fillRect/>
+                          </a:stretch>
+                        </pic:blipFill>
+                        <pic:spPr>
+                          <a:xfrm>
+                            <a:off x="0" y="0"/>
+                            <a:ext cx="5731510" cy="2161540"/>
+                          </a:xfrm>
+                          <a:prstGeom prst="rect">
+                            <a:avLst/>
+                          </a:prstGeom>
+                        </pic:spPr>
+                      </pic:pic>
+                    </a:graphicData>
+                  </a:graphic>
+                </wp:inline>
+              </w:drawing>
+            </w:r>
             <w:r>
               <w:rPr>
                 <w:b w:val="0"/>
@@ -1635,14 +1368,13 @@
       <w:pPr>
         <w:pStyle w:val="2"/>
       </w:pPr>
-      <w:proofErr w:type="spellStart"/>
       <w:r>
         <w:rPr>
           <w:rFonts w:hint="eastAsia"/>
         </w:rPr>
+        <w:lastRenderedPageBreak/>
         <w:t>Github</w:t>
       </w:r>
-      <w:proofErr w:type="spellEnd"/>
       <w:r>
         <w:t xml:space="preserve"> (Screen Shots)</w:t>
       </w:r>
@@ -1654,8 +1386,8 @@
         <w:tblLook w:val="04A0" w:firstRow="1" w:lastRow="0" w:firstColumn="1" w:lastColumn="0" w:noHBand="0" w:noVBand="1"/>
       </w:tblPr>
       <w:tblGrid>
-        <w:gridCol w:w="439"/>
-        <w:gridCol w:w="8577"/>
+        <w:gridCol w:w="737"/>
+        <w:gridCol w:w="8279"/>
       </w:tblGrid>
       <w:tr>
         <w:trPr>
@@ -1674,7 +1406,7 @@
               <w:spacing w:after="0" w:line="240" w:lineRule="auto"/>
               <w:jc w:val="both"/>
               <w:rPr>
-                <w:rFonts w:ascii="Arial" w:hAnsi="Arial" w:cs="Arial" w:hint="eastAsia"/>
+                <w:rFonts w:ascii="Arial" w:hAnsi="Arial" w:cs="Arial"/>
                 <w:b w:val="0"/>
                 <w:sz w:val="20"/>
               </w:rPr>
@@ -1708,7 +1440,7 @@
               <w:jc w:val="both"/>
               <w:cnfStyle w:val="100000000000" w:firstRow="1" w:lastRow="0" w:firstColumn="0" w:lastColumn="0" w:oddVBand="0" w:evenVBand="0" w:oddHBand="0" w:evenHBand="0" w:firstRowFirstColumn="0" w:firstRowLastColumn="0" w:lastRowFirstColumn="0" w:lastRowLastColumn="0"/>
               <w:rPr>
-                <w:rFonts w:ascii="Arial" w:hAnsi="Arial" w:cs="Arial" w:hint="eastAsia"/>
+                <w:rFonts w:ascii="Arial" w:hAnsi="Arial" w:cs="Arial"/>
                 <w:b w:val="0"/>
                 <w:sz w:val="20"/>
               </w:rPr>
@@ -1727,18 +1459,8 @@
                 <w:b w:val="0"/>
                 <w:sz w:val="20"/>
               </w:rPr>
-              <w:t xml:space="preserve"> </w:t>
-            </w:r>
-            <w:proofErr w:type="spellStart"/>
-            <w:r>
-              <w:rPr>
-                <w:rFonts w:ascii="Arial" w:hAnsi="Arial" w:cs="Arial" w:hint="eastAsia"/>
-                <w:b w:val="0"/>
-                <w:sz w:val="20"/>
-              </w:rPr>
-              <w:t>Github</w:t>
-            </w:r>
-            <w:proofErr w:type="spellEnd"/>
+              <w:t xml:space="preserve"> Github</w:t>
+            </w:r>
             <w:r>
               <w:rPr>
                 <w:rFonts w:ascii="Arial" w:hAnsi="Arial" w:cs="Arial" w:hint="eastAsia"/>
@@ -1889,6 +1611,47 @@
                 <w:sz w:val="20"/>
               </w:rPr>
             </w:pPr>
+            <w:r>
+              <w:rPr>
+                <w:rFonts w:ascii="Arial" w:hAnsi="Arial" w:cs="Arial"/>
+                <w:sz w:val="20"/>
+              </w:rPr>
+              <w:drawing>
+                <wp:inline distT="0" distB="0" distL="0" distR="0" wp14:anchorId="6F240928" wp14:editId="54803B7E">
+                  <wp:extent cx="5731510" cy="6823075"/>
+                  <wp:effectExtent l="0" t="0" r="2540" b="0"/>
+                  <wp:docPr id="201164002" name="그림 1"/>
+                  <wp:cNvGraphicFramePr>
+                    <a:graphicFrameLocks xmlns:a="http://schemas.openxmlformats.org/drawingml/2006/main" noChangeAspect="1"/>
+                  </wp:cNvGraphicFramePr>
+                  <a:graphic xmlns:a="http://schemas.openxmlformats.org/drawingml/2006/main">
+                    <a:graphicData uri="http://schemas.openxmlformats.org/drawingml/2006/picture">
+                      <pic:pic xmlns:pic="http://schemas.openxmlformats.org/drawingml/2006/picture">
+                        <pic:nvPicPr>
+                          <pic:cNvPr id="201164002" name=""/>
+                          <pic:cNvPicPr/>
+                        </pic:nvPicPr>
+                        <pic:blipFill>
+                          <a:blip r:embed="rId14"/>
+                          <a:stretch>
+                            <a:fillRect/>
+                          </a:stretch>
+                        </pic:blipFill>
+                        <pic:spPr>
+                          <a:xfrm>
+                            <a:off x="0" y="0"/>
+                            <a:ext cx="5731510" cy="6823075"/>
+                          </a:xfrm>
+                          <a:prstGeom prst="rect">
+                            <a:avLst/>
+                          </a:prstGeom>
+                        </pic:spPr>
+                      </pic:pic>
+                    </a:graphicData>
+                  </a:graphic>
+                </wp:inline>
+              </w:drawing>
+            </w:r>
           </w:p>
           <w:p>
             <w:pPr>
@@ -2010,165 +1773,9 @@
               <w:adjustRightInd w:val="0"/>
               <w:spacing w:after="0" w:line="240" w:lineRule="auto"/>
               <w:rPr>
-                <w:rFonts w:ascii="Consolas" w:eastAsiaTheme="minorEastAsia" w:hAnsi="Consolas" w:cs="Consolas"/>
-                <w:b/>
-                <w:bCs/>
-                <w:color w:val="7F0055"/>
-                <w:sz w:val="20"/>
-              </w:rPr>
-            </w:pPr>
-            <w:proofErr w:type="gramStart"/>
-            <w:r>
-              <w:rPr>
-                <w:rFonts w:ascii="Consolas" w:eastAsiaTheme="minorEastAsia" w:hAnsi="Consolas" w:cs="Consolas" w:hint="eastAsia"/>
-                <w:b/>
-                <w:bCs/>
-                <w:color w:val="7F0055"/>
-                <w:sz w:val="20"/>
-              </w:rPr>
-              <w:t xml:space="preserve">// </w:t>
-            </w:r>
-            <w:r>
-              <w:rPr>
-                <w:rFonts w:ascii="Consolas" w:eastAsiaTheme="minorEastAsia" w:hAnsi="Consolas" w:cs="Consolas" w:hint="eastAsia"/>
-                <w:b/>
-                <w:bCs/>
-                <w:color w:val="7F0055"/>
-                <w:sz w:val="20"/>
-              </w:rPr>
-              <w:t>아래</w:t>
-            </w:r>
-            <w:proofErr w:type="gramEnd"/>
-            <w:r>
-              <w:rPr>
-                <w:rFonts w:ascii="Consolas" w:eastAsiaTheme="minorEastAsia" w:hAnsi="Consolas" w:cs="Consolas" w:hint="eastAsia"/>
-                <w:b/>
-                <w:bCs/>
-                <w:color w:val="7F0055"/>
-                <w:sz w:val="20"/>
-              </w:rPr>
-              <w:t xml:space="preserve"> </w:t>
-            </w:r>
-            <w:r>
-              <w:rPr>
-                <w:rFonts w:ascii="Consolas" w:eastAsiaTheme="minorEastAsia" w:hAnsi="Consolas" w:cs="Consolas" w:hint="eastAsia"/>
-                <w:b/>
-                <w:bCs/>
-                <w:color w:val="7F0055"/>
-                <w:sz w:val="20"/>
-              </w:rPr>
-              <w:t>내용</w:t>
-            </w:r>
-            <w:r>
-              <w:rPr>
-                <w:rFonts w:ascii="Consolas" w:eastAsiaTheme="minorEastAsia" w:hAnsi="Consolas" w:cs="Consolas" w:hint="eastAsia"/>
-                <w:b/>
-                <w:bCs/>
-                <w:color w:val="7F0055"/>
-                <w:sz w:val="20"/>
-              </w:rPr>
-              <w:t xml:space="preserve"> </w:t>
-            </w:r>
-            <w:r>
-              <w:rPr>
-                <w:rFonts w:ascii="Consolas" w:eastAsiaTheme="minorEastAsia" w:hAnsi="Consolas" w:cs="Consolas" w:hint="eastAsia"/>
-                <w:b/>
-                <w:bCs/>
-                <w:color w:val="7F0055"/>
-                <w:sz w:val="20"/>
-              </w:rPr>
-              <w:t>삭제</w:t>
-            </w:r>
-            <w:r>
-              <w:rPr>
-                <w:rFonts w:ascii="Consolas" w:eastAsiaTheme="minorEastAsia" w:hAnsi="Consolas" w:cs="Consolas" w:hint="eastAsia"/>
-                <w:b/>
-                <w:bCs/>
-                <w:color w:val="7F0055"/>
-                <w:sz w:val="20"/>
-              </w:rPr>
-              <w:t xml:space="preserve"> </w:t>
-            </w:r>
-            <w:r>
-              <w:rPr>
-                <w:rFonts w:ascii="Consolas" w:eastAsiaTheme="minorEastAsia" w:hAnsi="Consolas" w:cs="Consolas" w:hint="eastAsia"/>
-                <w:b/>
-                <w:bCs/>
-                <w:color w:val="7F0055"/>
-                <w:sz w:val="20"/>
-              </w:rPr>
-              <w:t>후</w:t>
-            </w:r>
-            <w:r>
-              <w:rPr>
-                <w:rFonts w:ascii="Consolas" w:eastAsiaTheme="minorEastAsia" w:hAnsi="Consolas" w:cs="Consolas" w:hint="eastAsia"/>
-                <w:b/>
-                <w:bCs/>
-                <w:color w:val="7F0055"/>
-                <w:sz w:val="20"/>
-              </w:rPr>
-              <w:t xml:space="preserve"> </w:t>
-            </w:r>
-            <w:r>
-              <w:rPr>
-                <w:rFonts w:ascii="Consolas" w:eastAsiaTheme="minorEastAsia" w:hAnsi="Consolas" w:cs="Consolas" w:hint="eastAsia"/>
-                <w:b/>
-                <w:bCs/>
-                <w:color w:val="7F0055"/>
-                <w:sz w:val="20"/>
-              </w:rPr>
-              <w:t>본인</w:t>
-            </w:r>
-            <w:r>
-              <w:rPr>
-                <w:rFonts w:ascii="Consolas" w:eastAsiaTheme="minorEastAsia" w:hAnsi="Consolas" w:cs="Consolas" w:hint="eastAsia"/>
-                <w:b/>
-                <w:bCs/>
-                <w:color w:val="7F0055"/>
-                <w:sz w:val="20"/>
-              </w:rPr>
-              <w:t xml:space="preserve"> </w:t>
-            </w:r>
-            <w:r>
-              <w:rPr>
-                <w:rFonts w:ascii="Consolas" w:eastAsiaTheme="minorEastAsia" w:hAnsi="Consolas" w:cs="Consolas" w:hint="eastAsia"/>
-                <w:b/>
-                <w:bCs/>
-                <w:color w:val="7F0055"/>
-                <w:sz w:val="20"/>
-              </w:rPr>
-              <w:t>코드로</w:t>
-            </w:r>
-            <w:r>
-              <w:rPr>
-                <w:rFonts w:ascii="Consolas" w:eastAsiaTheme="minorEastAsia" w:hAnsi="Consolas" w:cs="Consolas" w:hint="eastAsia"/>
-                <w:b/>
-                <w:bCs/>
-                <w:color w:val="7F0055"/>
-                <w:sz w:val="20"/>
-              </w:rPr>
-              <w:t xml:space="preserve"> </w:t>
-            </w:r>
-            <w:r>
-              <w:rPr>
-                <w:rFonts w:ascii="Consolas" w:eastAsiaTheme="minorEastAsia" w:hAnsi="Consolas" w:cs="Consolas" w:hint="eastAsia"/>
-                <w:b/>
-                <w:bCs/>
-                <w:color w:val="7F0055"/>
-                <w:sz w:val="20"/>
-              </w:rPr>
-              <w:t>대체</w:t>
-            </w:r>
-            <w:r>
-              <w:rPr>
-                <w:rFonts w:ascii="Consolas" w:eastAsiaTheme="minorEastAsia" w:hAnsi="Consolas" w:cs="Consolas" w:hint="eastAsia"/>
-                <w:b/>
-                <w:bCs/>
-                <w:color w:val="7F0055"/>
-                <w:sz w:val="20"/>
-              </w:rPr>
-              <w:t xml:space="preserve"> </w:t>
-            </w:r>
+                <w:rFonts w:ascii="Consolas" w:hAnsi="Consolas"/>
+              </w:rPr>
+            </w:pPr>
           </w:p>
           <w:p>
             <w:pPr>
@@ -2178,11 +1785,7 @@
               <w:adjustRightInd w:val="0"/>
               <w:spacing w:after="0" w:line="240" w:lineRule="auto"/>
               <w:rPr>
-                <w:rFonts w:ascii="Consolas" w:eastAsiaTheme="minorEastAsia" w:hAnsi="Consolas" w:cs="Consolas"/>
-                <w:b/>
-                <w:bCs/>
-                <w:color w:val="7F0055"/>
-                <w:sz w:val="20"/>
+                <w:rFonts w:ascii="Consolas" w:hAnsi="Consolas" w:hint="eastAsia"/>
               </w:rPr>
             </w:pPr>
           </w:p>
@@ -2194,56 +1797,62 @@
               <w:adjustRightInd w:val="0"/>
               <w:spacing w:after="0" w:line="240" w:lineRule="auto"/>
               <w:rPr>
-                <w:rFonts w:ascii="Consolas" w:eastAsiaTheme="minorEastAsia" w:hAnsi="Consolas" w:cs="Consolas"/>
-                <w:color w:val="auto"/>
-                <w:sz w:val="20"/>
-              </w:rPr>
-            </w:pPr>
-            <w:r>
-              <w:rPr>
-                <w:rFonts w:ascii="Consolas" w:eastAsiaTheme="minorEastAsia" w:hAnsi="Consolas" w:cs="Consolas"/>
-                <w:b/>
-                <w:bCs/>
-                <w:color w:val="7F0055"/>
-                <w:sz w:val="20"/>
-              </w:rPr>
-              <w:t>import</w:t>
-            </w:r>
-            <w:r>
-              <w:rPr>
-                <w:rFonts w:ascii="Consolas" w:eastAsiaTheme="minorEastAsia" w:hAnsi="Consolas" w:cs="Consolas"/>
-                <w:color w:val="000000"/>
-                <w:sz w:val="20"/>
+                <w:rFonts w:ascii="Consolas" w:hAnsi="Consolas" w:hint="eastAsia"/>
+              </w:rPr>
+            </w:pPr>
+            <w:r>
+              <w:rPr>
+                <w:rFonts w:ascii="Consolas" w:hAnsi="Consolas" w:hint="eastAsia"/>
+              </w:rPr>
+              <w:t>최종</w:t>
+            </w:r>
+            <w:r>
+              <w:rPr>
+                <w:rFonts w:ascii="Consolas" w:hAnsi="Consolas" w:hint="eastAsia"/>
               </w:rPr>
               <w:t xml:space="preserve"> </w:t>
             </w:r>
-            <w:proofErr w:type="spellStart"/>
-            <w:proofErr w:type="gramStart"/>
-            <w:r>
-              <w:rPr>
-                <w:rFonts w:ascii="Consolas" w:eastAsiaTheme="minorEastAsia" w:hAnsi="Consolas" w:cs="Consolas"/>
-                <w:color w:val="000000"/>
-                <w:sz w:val="20"/>
-              </w:rPr>
-              <w:t>java.util</w:t>
-            </w:r>
-            <w:proofErr w:type="gramEnd"/>
-            <w:r>
-              <w:rPr>
-                <w:rFonts w:ascii="Consolas" w:eastAsiaTheme="minorEastAsia" w:hAnsi="Consolas" w:cs="Consolas"/>
-                <w:color w:val="000000"/>
-                <w:sz w:val="20"/>
-              </w:rPr>
-              <w:t>.Scanner</w:t>
-            </w:r>
-            <w:proofErr w:type="spellEnd"/>
-            <w:r>
-              <w:rPr>
-                <w:rFonts w:ascii="Consolas" w:eastAsiaTheme="minorEastAsia" w:hAnsi="Consolas" w:cs="Consolas"/>
-                <w:color w:val="000000"/>
-                <w:sz w:val="20"/>
-              </w:rPr>
-              <w:t>;</w:t>
+            <w:r>
+              <w:rPr>
+                <w:rFonts w:ascii="Consolas" w:hAnsi="Consolas" w:hint="eastAsia"/>
+              </w:rPr>
+              <w:t>소스</w:t>
+            </w:r>
+            <w:r>
+              <w:rPr>
+                <w:rFonts w:ascii="Consolas" w:hAnsi="Consolas" w:hint="eastAsia"/>
+              </w:rPr>
+              <w:t xml:space="preserve"> </w:t>
+            </w:r>
+            <w:r>
+              <w:rPr>
+                <w:rFonts w:ascii="Consolas" w:hAnsi="Consolas" w:hint="eastAsia"/>
+              </w:rPr>
+              <w:t>코드</w:t>
+            </w:r>
+            <w:r>
+              <w:rPr>
+                <w:rFonts w:ascii="Consolas" w:hAnsi="Consolas" w:hint="eastAsia"/>
+              </w:rPr>
+              <w:t xml:space="preserve"> (</w:t>
+            </w:r>
+            <w:r>
+              <w:rPr>
+                <w:rFonts w:ascii="Consolas" w:hAnsi="Consolas" w:hint="eastAsia"/>
+              </w:rPr>
+              <w:t>제출파일</w:t>
+            </w:r>
+            <w:r>
+              <w:rPr>
+                <w:rFonts w:ascii="Consolas" w:hAnsi="Consolas" w:hint="eastAsia"/>
+              </w:rPr>
+              <w:t xml:space="preserve"> copy &amp; past)</w:t>
+            </w:r>
+            <w:r>
+              <w:rPr>
+                <w:rFonts w:ascii="Consolas" w:hAnsi="Consolas" w:hint="eastAsia"/>
+              </w:rPr>
+              <w:t>하기</w:t>
             </w:r>
           </w:p>
           <w:p>
@@ -2254,283 +1863,9 @@
               <w:adjustRightInd w:val="0"/>
               <w:spacing w:after="0" w:line="240" w:lineRule="auto"/>
               <w:rPr>
-                <w:rFonts w:ascii="Consolas" w:eastAsiaTheme="minorEastAsia" w:hAnsi="Consolas" w:cs="Consolas"/>
-                <w:color w:val="auto"/>
-                <w:sz w:val="20"/>
-              </w:rPr>
-            </w:pPr>
-          </w:p>
-          <w:p>
-            <w:pPr>
-              <w:widowControl w:val="0"/>
-              <w:autoSpaceDE w:val="0"/>
-              <w:autoSpaceDN w:val="0"/>
-              <w:adjustRightInd w:val="0"/>
-              <w:spacing w:after="0" w:line="240" w:lineRule="auto"/>
-              <w:rPr>
-                <w:rFonts w:ascii="Consolas" w:eastAsiaTheme="minorEastAsia" w:hAnsi="Consolas" w:cs="Consolas"/>
-                <w:color w:val="auto"/>
-                <w:sz w:val="20"/>
-              </w:rPr>
-            </w:pPr>
-            <w:r>
-              <w:rPr>
-                <w:rFonts w:ascii="Consolas" w:eastAsiaTheme="minorEastAsia" w:hAnsi="Consolas" w:cs="Consolas"/>
-                <w:b/>
-                <w:bCs/>
-                <w:color w:val="7F0055"/>
-                <w:sz w:val="20"/>
-              </w:rPr>
-              <w:t>public</w:t>
-            </w:r>
-            <w:r>
-              <w:rPr>
-                <w:rFonts w:ascii="Consolas" w:eastAsiaTheme="minorEastAsia" w:hAnsi="Consolas" w:cs="Consolas"/>
-                <w:color w:val="000000"/>
-                <w:sz w:val="20"/>
-              </w:rPr>
-              <w:t xml:space="preserve"> </w:t>
-            </w:r>
-            <w:r>
-              <w:rPr>
-                <w:rFonts w:ascii="Consolas" w:eastAsiaTheme="minorEastAsia" w:hAnsi="Consolas" w:cs="Consolas"/>
-                <w:b/>
-                <w:bCs/>
-                <w:color w:val="7F0055"/>
-                <w:sz w:val="20"/>
-              </w:rPr>
-              <w:t>class</w:t>
-            </w:r>
-            <w:r>
-              <w:rPr>
-                <w:rFonts w:ascii="Consolas" w:eastAsiaTheme="minorEastAsia" w:hAnsi="Consolas" w:cs="Consolas"/>
-                <w:color w:val="000000"/>
-                <w:sz w:val="20"/>
-              </w:rPr>
-              <w:t xml:space="preserve"> </w:t>
-            </w:r>
-            <w:proofErr w:type="spellStart"/>
-            <w:r>
-              <w:rPr>
-                <w:rFonts w:ascii="Consolas" w:eastAsiaTheme="minorEastAsia" w:hAnsi="Consolas" w:cs="Consolas"/>
-                <w:color w:val="000000"/>
-                <w:sz w:val="20"/>
-              </w:rPr>
-              <w:t>FirstProgram</w:t>
-            </w:r>
-            <w:proofErr w:type="spellEnd"/>
-            <w:r>
-              <w:rPr>
-                <w:rFonts w:ascii="Consolas" w:eastAsiaTheme="minorEastAsia" w:hAnsi="Consolas" w:cs="Consolas"/>
-                <w:color w:val="000000"/>
-                <w:sz w:val="20"/>
-              </w:rPr>
-              <w:t xml:space="preserve"> {</w:t>
-            </w:r>
-          </w:p>
-          <w:p>
-            <w:pPr>
-              <w:widowControl w:val="0"/>
-              <w:autoSpaceDE w:val="0"/>
-              <w:autoSpaceDN w:val="0"/>
-              <w:adjustRightInd w:val="0"/>
-              <w:spacing w:after="0" w:line="240" w:lineRule="auto"/>
-              <w:rPr>
-                <w:rFonts w:ascii="Consolas" w:eastAsiaTheme="minorEastAsia" w:hAnsi="Consolas" w:cs="Consolas"/>
-                <w:color w:val="auto"/>
-                <w:sz w:val="20"/>
-              </w:rPr>
-            </w:pPr>
-          </w:p>
-          <w:p>
-            <w:pPr>
-              <w:widowControl w:val="0"/>
-              <w:autoSpaceDE w:val="0"/>
-              <w:autoSpaceDN w:val="0"/>
-              <w:adjustRightInd w:val="0"/>
-              <w:spacing w:after="0" w:line="240" w:lineRule="auto"/>
-              <w:rPr>
-                <w:rFonts w:ascii="Consolas" w:eastAsiaTheme="minorEastAsia" w:hAnsi="Consolas" w:cs="Consolas"/>
-                <w:color w:val="auto"/>
-                <w:sz w:val="20"/>
-              </w:rPr>
-            </w:pPr>
-            <w:r>
-              <w:rPr>
-                <w:rFonts w:ascii="Consolas" w:eastAsiaTheme="minorEastAsia" w:hAnsi="Consolas" w:cs="Consolas"/>
-                <w:color w:val="000000"/>
-                <w:sz w:val="20"/>
-              </w:rPr>
-              <w:tab/>
-            </w:r>
-            <w:r>
-              <w:rPr>
-                <w:rFonts w:ascii="Consolas" w:eastAsiaTheme="minorEastAsia" w:hAnsi="Consolas" w:cs="Consolas"/>
-                <w:b/>
-                <w:bCs/>
-                <w:color w:val="7F0055"/>
-                <w:sz w:val="20"/>
-              </w:rPr>
-              <w:t>public</w:t>
-            </w:r>
-            <w:r>
-              <w:rPr>
-                <w:rFonts w:ascii="Consolas" w:eastAsiaTheme="minorEastAsia" w:hAnsi="Consolas" w:cs="Consolas"/>
-                <w:color w:val="000000"/>
-                <w:sz w:val="20"/>
-              </w:rPr>
-              <w:t xml:space="preserve"> </w:t>
-            </w:r>
-            <w:r>
-              <w:rPr>
-                <w:rFonts w:ascii="Consolas" w:eastAsiaTheme="minorEastAsia" w:hAnsi="Consolas" w:cs="Consolas"/>
-                <w:b/>
-                <w:bCs/>
-                <w:color w:val="7F0055"/>
-                <w:sz w:val="20"/>
-              </w:rPr>
-              <w:t>static</w:t>
-            </w:r>
-            <w:r>
-              <w:rPr>
-                <w:rFonts w:ascii="Consolas" w:eastAsiaTheme="minorEastAsia" w:hAnsi="Consolas" w:cs="Consolas"/>
-                <w:color w:val="000000"/>
-                <w:sz w:val="20"/>
-              </w:rPr>
-              <w:t xml:space="preserve"> </w:t>
-            </w:r>
-            <w:r>
-              <w:rPr>
-                <w:rFonts w:ascii="Consolas" w:eastAsiaTheme="minorEastAsia" w:hAnsi="Consolas" w:cs="Consolas"/>
-                <w:b/>
-                <w:bCs/>
-                <w:color w:val="7F0055"/>
-                <w:sz w:val="20"/>
-              </w:rPr>
-              <w:t>void</w:t>
-            </w:r>
-            <w:r>
-              <w:rPr>
-                <w:rFonts w:ascii="Consolas" w:eastAsiaTheme="minorEastAsia" w:hAnsi="Consolas" w:cs="Consolas"/>
-                <w:color w:val="000000"/>
-                <w:sz w:val="20"/>
-              </w:rPr>
-              <w:t xml:space="preserve"> </w:t>
-            </w:r>
-            <w:proofErr w:type="gramStart"/>
-            <w:r>
-              <w:rPr>
-                <w:rFonts w:ascii="Consolas" w:eastAsiaTheme="minorEastAsia" w:hAnsi="Consolas" w:cs="Consolas"/>
-                <w:color w:val="000000"/>
-                <w:sz w:val="20"/>
-              </w:rPr>
-              <w:t>main(String[</w:t>
-            </w:r>
-            <w:proofErr w:type="gramEnd"/>
-            <w:r>
-              <w:rPr>
-                <w:rFonts w:ascii="Consolas" w:eastAsiaTheme="minorEastAsia" w:hAnsi="Consolas" w:cs="Consolas"/>
-                <w:color w:val="000000"/>
-                <w:sz w:val="20"/>
-              </w:rPr>
-              <w:t xml:space="preserve">] </w:t>
-            </w:r>
-            <w:proofErr w:type="spellStart"/>
-            <w:proofErr w:type="gramStart"/>
-            <w:r>
-              <w:rPr>
-                <w:rFonts w:ascii="Consolas" w:eastAsiaTheme="minorEastAsia" w:hAnsi="Consolas" w:cs="Consolas"/>
-                <w:color w:val="6A3E3E"/>
-                <w:sz w:val="20"/>
-              </w:rPr>
-              <w:t>args</w:t>
-            </w:r>
-            <w:proofErr w:type="spellEnd"/>
-            <w:r>
-              <w:rPr>
-                <w:rFonts w:ascii="Consolas" w:eastAsiaTheme="minorEastAsia" w:hAnsi="Consolas" w:cs="Consolas"/>
-                <w:color w:val="000000"/>
-                <w:sz w:val="20"/>
-              </w:rPr>
-              <w:t>) {</w:t>
-            </w:r>
-            <w:proofErr w:type="gramEnd"/>
-          </w:p>
-          <w:p>
-            <w:pPr>
-              <w:widowControl w:val="0"/>
-              <w:autoSpaceDE w:val="0"/>
-              <w:autoSpaceDN w:val="0"/>
-              <w:adjustRightInd w:val="0"/>
-              <w:spacing w:after="0" w:line="240" w:lineRule="auto"/>
-              <w:rPr>
-                <w:rFonts w:ascii="Consolas" w:eastAsiaTheme="minorEastAsia" w:hAnsi="Consolas" w:cs="Consolas"/>
-                <w:color w:val="auto"/>
-                <w:sz w:val="20"/>
-              </w:rPr>
-            </w:pPr>
-            <w:r>
-              <w:rPr>
-                <w:rFonts w:ascii="Consolas" w:eastAsiaTheme="minorEastAsia" w:hAnsi="Consolas" w:cs="Consolas"/>
-                <w:color w:val="000000"/>
-                <w:sz w:val="20"/>
-              </w:rPr>
-              <w:tab/>
-            </w:r>
-            <w:r>
-              <w:rPr>
-                <w:rFonts w:ascii="Consolas" w:eastAsiaTheme="minorEastAsia" w:hAnsi="Consolas" w:cs="Consolas"/>
-                <w:color w:val="000000"/>
-                <w:sz w:val="20"/>
-              </w:rPr>
-              <w:tab/>
-            </w:r>
-            <w:r>
-              <w:rPr>
-                <w:rFonts w:ascii="Consolas" w:eastAsiaTheme="minorEastAsia" w:hAnsi="Consolas" w:cs="Consolas"/>
-                <w:color w:val="3F7F5F"/>
-                <w:sz w:val="20"/>
-              </w:rPr>
-              <w:t xml:space="preserve">// </w:t>
-            </w:r>
-            <w:r>
-              <w:rPr>
-                <w:rFonts w:ascii="Consolas" w:eastAsiaTheme="minorEastAsia" w:hAnsi="Consolas" w:cs="Consolas"/>
-                <w:b/>
-                <w:bCs/>
-                <w:color w:val="7F9FBF"/>
-                <w:sz w:val="20"/>
-              </w:rPr>
-              <w:t>TODO</w:t>
-            </w:r>
-            <w:r>
-              <w:rPr>
-                <w:rFonts w:ascii="Consolas" w:eastAsiaTheme="minorEastAsia" w:hAnsi="Consolas" w:cs="Consolas"/>
-                <w:color w:val="3F7F5F"/>
-                <w:sz w:val="20"/>
-              </w:rPr>
-              <w:t xml:space="preserve"> Auto-generated method stub</w:t>
-            </w:r>
-          </w:p>
-          <w:p>
-            <w:pPr>
-              <w:widowControl w:val="0"/>
-              <w:autoSpaceDE w:val="0"/>
-              <w:autoSpaceDN w:val="0"/>
-              <w:adjustRightInd w:val="0"/>
-              <w:spacing w:after="0" w:line="240" w:lineRule="auto"/>
-              <w:rPr>
                 <w:rFonts w:ascii="Consolas" w:hAnsi="Consolas"/>
               </w:rPr>
             </w:pPr>
-            <w:r>
-              <w:rPr>
-                <w:rFonts w:ascii="Consolas" w:eastAsiaTheme="minorEastAsia" w:hAnsi="Consolas" w:cs="Consolas"/>
-                <w:color w:val="000000"/>
-                <w:sz w:val="20"/>
-              </w:rPr>
-              <w:tab/>
-            </w:r>
             <w:r>
               <w:rPr>
                 <w:rFonts w:ascii="Consolas" w:eastAsiaTheme="minorEastAsia" w:hAnsi="Consolas" w:cs="Consolas"/>
@@ -2586,18 +1921,26 @@
               <w:spacing w:after="0" w:line="240" w:lineRule="auto"/>
               <w:jc w:val="both"/>
               <w:rPr>
-                <w:rFonts w:ascii="Arial" w:hAnsi="Arial" w:cs="Arial"/>
-                <w:b w:val="0"/>
-                <w:sz w:val="20"/>
-              </w:rPr>
-            </w:pPr>
-            <w:r>
-              <w:rPr>
-                <w:rFonts w:ascii="Arial" w:hAnsi="Arial" w:cs="Arial"/>
-                <w:b w:val="0"/>
-                <w:sz w:val="20"/>
-              </w:rPr>
-              <w:t>#1</w:t>
+                <w:rFonts w:ascii="Arial" w:hAnsi="Arial" w:cs="Arial" w:hint="eastAsia"/>
+                <w:b w:val="0"/>
+                <w:sz w:val="20"/>
+              </w:rPr>
+            </w:pPr>
+            <w:r>
+              <w:rPr>
+                <w:rFonts w:ascii="Arial" w:hAnsi="Arial" w:cs="Arial"/>
+                <w:b w:val="0"/>
+                <w:sz w:val="20"/>
+              </w:rPr>
+              <w:t>#</w:t>
+            </w:r>
+            <w:r>
+              <w:rPr>
+                <w:rFonts w:ascii="Arial" w:hAnsi="Arial" w:cs="Arial" w:hint="eastAsia"/>
+                <w:b w:val="0"/>
+                <w:sz w:val="20"/>
+              </w:rPr>
+              <w:t>3</w:t>
             </w:r>
           </w:p>
         </w:tc>
@@ -2684,33 +2027,6 @@
               <w:spacing w:after="0" w:line="240" w:lineRule="auto"/>
               <w:rPr>
                 <w:rFonts w:ascii="Arial" w:hAnsi="Arial" w:cs="Arial"/>
-                <w:sz w:val="20"/>
-              </w:rPr>
-            </w:pPr>
-          </w:p>
-          <w:p>
-            <w:pPr>
-              <w:spacing w:after="0" w:line="240" w:lineRule="auto"/>
-              <w:rPr>
-                <w:rFonts w:ascii="Arial" w:hAnsi="Arial" w:cs="Arial"/>
-                <w:sz w:val="20"/>
-              </w:rPr>
-            </w:pPr>
-          </w:p>
-          <w:p>
-            <w:pPr>
-              <w:spacing w:after="0" w:line="240" w:lineRule="auto"/>
-              <w:rPr>
-                <w:rFonts w:ascii="Arial" w:hAnsi="Arial" w:cs="Arial"/>
-                <w:sz w:val="20"/>
-              </w:rPr>
-            </w:pPr>
-          </w:p>
-          <w:p>
-            <w:pPr>
-              <w:spacing w:after="0" w:line="240" w:lineRule="auto"/>
-              <w:rPr>
-                <w:rFonts w:ascii="Arial" w:hAnsi="Arial" w:cs="Arial"/>
                 <w:b w:val="0"/>
                 <w:bCs w:val="0"/>
                 <w:sz w:val="20"/>
@@ -2718,29 +2034,374 @@
             </w:pPr>
             <w:r>
               <w:rPr>
+                <w:rFonts w:ascii="Arial" w:hAnsi="Arial" w:cs="Arial"/>
+                <w:sz w:val="20"/>
+              </w:rPr>
+              <w:drawing>
+                <wp:inline distT="0" distB="0" distL="0" distR="0" wp14:anchorId="19F56FFE" wp14:editId="77D62CED">
+                  <wp:extent cx="4115157" cy="472481"/>
+                  <wp:effectExtent l="0" t="0" r="0" b="3810"/>
+                  <wp:docPr id="948225813" name="그림 1"/>
+                  <wp:cNvGraphicFramePr>
+                    <a:graphicFrameLocks xmlns:a="http://schemas.openxmlformats.org/drawingml/2006/main" noChangeAspect="1"/>
+                  </wp:cNvGraphicFramePr>
+                  <a:graphic xmlns:a="http://schemas.openxmlformats.org/drawingml/2006/main">
+                    <a:graphicData uri="http://schemas.openxmlformats.org/drawingml/2006/picture">
+                      <pic:pic xmlns:pic="http://schemas.openxmlformats.org/drawingml/2006/picture">
+                        <pic:nvPicPr>
+                          <pic:cNvPr id="948225813" name=""/>
+                          <pic:cNvPicPr/>
+                        </pic:nvPicPr>
+                        <pic:blipFill>
+                          <a:blip r:embed="rId15"/>
+                          <a:stretch>
+                            <a:fillRect/>
+                          </a:stretch>
+                        </pic:blipFill>
+                        <pic:spPr>
+                          <a:xfrm>
+                            <a:off x="0" y="0"/>
+                            <a:ext cx="4115157" cy="472481"/>
+                          </a:xfrm>
+                          <a:prstGeom prst="rect">
+                            <a:avLst/>
+                          </a:prstGeom>
+                        </pic:spPr>
+                      </pic:pic>
+                    </a:graphicData>
+                  </a:graphic>
+                </wp:inline>
+              </w:drawing>
+            </w:r>
+          </w:p>
+          <w:p>
+            <w:pPr>
+              <w:spacing w:after="0" w:line="240" w:lineRule="auto"/>
+              <w:rPr>
+                <w:rFonts w:ascii="Arial" w:hAnsi="Arial" w:cs="Arial"/>
                 <w:b w:val="0"/>
                 <w:bCs w:val="0"/>
-                <w:color w:val="FF0000"/>
-              </w:rPr>
-              <w:br/>
+                <w:sz w:val="20"/>
+              </w:rPr>
+            </w:pPr>
+          </w:p>
+          <w:p>
+            <w:pPr>
+              <w:spacing w:after="0" w:line="240" w:lineRule="auto"/>
+              <w:rPr>
+                <w:rFonts w:ascii="Arial" w:hAnsi="Arial" w:cs="Arial"/>
+                <w:b w:val="0"/>
+                <w:bCs w:val="0"/>
+                <w:sz w:val="20"/>
+              </w:rPr>
+            </w:pPr>
+            <w:r>
+              <w:rPr>
+                <w:rFonts w:ascii="Arial" w:hAnsi="Arial" w:cs="Arial"/>
+                <w:sz w:val="20"/>
+              </w:rPr>
+              <w:drawing>
+                <wp:inline distT="0" distB="0" distL="0" distR="0" wp14:anchorId="394F93A5" wp14:editId="3CDFF71C">
+                  <wp:extent cx="4244708" cy="434378"/>
+                  <wp:effectExtent l="0" t="0" r="3810" b="3810"/>
+                  <wp:docPr id="1246782072" name="그림 1"/>
+                  <wp:cNvGraphicFramePr>
+                    <a:graphicFrameLocks xmlns:a="http://schemas.openxmlformats.org/drawingml/2006/main" noChangeAspect="1"/>
+                  </wp:cNvGraphicFramePr>
+                  <a:graphic xmlns:a="http://schemas.openxmlformats.org/drawingml/2006/main">
+                    <a:graphicData uri="http://schemas.openxmlformats.org/drawingml/2006/picture">
+                      <pic:pic xmlns:pic="http://schemas.openxmlformats.org/drawingml/2006/picture">
+                        <pic:nvPicPr>
+                          <pic:cNvPr id="1246782072" name=""/>
+                          <pic:cNvPicPr/>
+                        </pic:nvPicPr>
+                        <pic:blipFill>
+                          <a:blip r:embed="rId16"/>
+                          <a:stretch>
+                            <a:fillRect/>
+                          </a:stretch>
+                        </pic:blipFill>
+                        <pic:spPr>
+                          <a:xfrm>
+                            <a:off x="0" y="0"/>
+                            <a:ext cx="4244708" cy="434378"/>
+                          </a:xfrm>
+                          <a:prstGeom prst="rect">
+                            <a:avLst/>
+                          </a:prstGeom>
+                        </pic:spPr>
+                      </pic:pic>
+                    </a:graphicData>
+                  </a:graphic>
+                </wp:inline>
+              </w:drawing>
+            </w:r>
+          </w:p>
+          <w:p>
+            <w:pPr>
+              <w:spacing w:after="0" w:line="240" w:lineRule="auto"/>
+              <w:rPr>
+                <w:rFonts w:ascii="Arial" w:hAnsi="Arial" w:cs="Arial"/>
+                <w:b w:val="0"/>
+                <w:bCs w:val="0"/>
+                <w:sz w:val="20"/>
+              </w:rPr>
+            </w:pPr>
+          </w:p>
+          <w:p>
+            <w:pPr>
+              <w:spacing w:after="0" w:line="240" w:lineRule="auto"/>
+              <w:rPr>
+                <w:rFonts w:ascii="Arial" w:hAnsi="Arial" w:cs="Arial"/>
+                <w:b w:val="0"/>
+                <w:bCs w:val="0"/>
+                <w:sz w:val="20"/>
+              </w:rPr>
+            </w:pPr>
+            <w:r>
+              <w:rPr>
+                <w:rFonts w:ascii="Arial" w:hAnsi="Arial" w:cs="Arial"/>
+                <w:sz w:val="20"/>
+              </w:rPr>
+              <w:drawing>
+                <wp:inline distT="0" distB="0" distL="0" distR="0" wp14:anchorId="41951515" wp14:editId="0F56930F">
+                  <wp:extent cx="4549534" cy="624894"/>
+                  <wp:effectExtent l="0" t="0" r="3810" b="3810"/>
+                  <wp:docPr id="1806632321" name="그림 1"/>
+                  <wp:cNvGraphicFramePr>
+                    <a:graphicFrameLocks xmlns:a="http://schemas.openxmlformats.org/drawingml/2006/main" noChangeAspect="1"/>
+                  </wp:cNvGraphicFramePr>
+                  <a:graphic xmlns:a="http://schemas.openxmlformats.org/drawingml/2006/main">
+                    <a:graphicData uri="http://schemas.openxmlformats.org/drawingml/2006/picture">
+                      <pic:pic xmlns:pic="http://schemas.openxmlformats.org/drawingml/2006/picture">
+                        <pic:nvPicPr>
+                          <pic:cNvPr id="1806632321" name=""/>
+                          <pic:cNvPicPr/>
+                        </pic:nvPicPr>
+                        <pic:blipFill>
+                          <a:blip r:embed="rId17"/>
+                          <a:stretch>
+                            <a:fillRect/>
+                          </a:stretch>
+                        </pic:blipFill>
+                        <pic:spPr>
+                          <a:xfrm>
+                            <a:off x="0" y="0"/>
+                            <a:ext cx="4549534" cy="624894"/>
+                          </a:xfrm>
+                          <a:prstGeom prst="rect">
+                            <a:avLst/>
+                          </a:prstGeom>
+                        </pic:spPr>
+                      </pic:pic>
+                    </a:graphicData>
+                  </a:graphic>
+                </wp:inline>
+              </w:drawing>
+            </w:r>
+          </w:p>
+          <w:p>
+            <w:pPr>
+              <w:spacing w:after="0" w:line="240" w:lineRule="auto"/>
+              <w:rPr>
+                <w:rFonts w:ascii="Arial" w:hAnsi="Arial" w:cs="Arial"/>
+                <w:b w:val="0"/>
+                <w:bCs w:val="0"/>
+                <w:sz w:val="20"/>
+              </w:rPr>
+            </w:pPr>
+          </w:p>
+          <w:p>
+            <w:pPr>
+              <w:spacing w:after="0" w:line="240" w:lineRule="auto"/>
+              <w:rPr>
+                <w:rFonts w:ascii="Arial" w:hAnsi="Arial" w:cs="Arial"/>
+                <w:b w:val="0"/>
+                <w:bCs w:val="0"/>
+                <w:sz w:val="20"/>
+              </w:rPr>
+            </w:pPr>
+            <w:r>
+              <w:rPr>
+                <w:rFonts w:ascii="Arial" w:hAnsi="Arial" w:cs="Arial"/>
+                <w:sz w:val="20"/>
+              </w:rPr>
+              <w:drawing>
+                <wp:inline distT="0" distB="0" distL="0" distR="0" wp14:anchorId="1302CA1A" wp14:editId="6D100376">
+                  <wp:extent cx="2339543" cy="472481"/>
+                  <wp:effectExtent l="0" t="0" r="3810" b="3810"/>
+                  <wp:docPr id="1111138606" name="그림 1"/>
+                  <wp:cNvGraphicFramePr>
+                    <a:graphicFrameLocks xmlns:a="http://schemas.openxmlformats.org/drawingml/2006/main" noChangeAspect="1"/>
+                  </wp:cNvGraphicFramePr>
+                  <a:graphic xmlns:a="http://schemas.openxmlformats.org/drawingml/2006/main">
+                    <a:graphicData uri="http://schemas.openxmlformats.org/drawingml/2006/picture">
+                      <pic:pic xmlns:pic="http://schemas.openxmlformats.org/drawingml/2006/picture">
+                        <pic:nvPicPr>
+                          <pic:cNvPr id="1111138606" name=""/>
+                          <pic:cNvPicPr/>
+                        </pic:nvPicPr>
+                        <pic:blipFill>
+                          <a:blip r:embed="rId18"/>
+                          <a:stretch>
+                            <a:fillRect/>
+                          </a:stretch>
+                        </pic:blipFill>
+                        <pic:spPr>
+                          <a:xfrm>
+                            <a:off x="0" y="0"/>
+                            <a:ext cx="2339543" cy="472481"/>
+                          </a:xfrm>
+                          <a:prstGeom prst="rect">
+                            <a:avLst/>
+                          </a:prstGeom>
+                        </pic:spPr>
+                      </pic:pic>
+                    </a:graphicData>
+                  </a:graphic>
+                </wp:inline>
+              </w:drawing>
+            </w:r>
+          </w:p>
+          <w:p>
+            <w:pPr>
+              <w:spacing w:after="0" w:line="240" w:lineRule="auto"/>
+              <w:rPr>
+                <w:rFonts w:ascii="Arial" w:hAnsi="Arial" w:cs="Arial"/>
+                <w:b w:val="0"/>
+                <w:bCs w:val="0"/>
+                <w:sz w:val="20"/>
+              </w:rPr>
+            </w:pPr>
+          </w:p>
+          <w:p>
+            <w:pPr>
+              <w:spacing w:after="0" w:line="240" w:lineRule="auto"/>
+              <w:rPr>
+                <w:rFonts w:ascii="Arial" w:hAnsi="Arial" w:cs="Arial"/>
+                <w:b w:val="0"/>
+                <w:bCs w:val="0"/>
+                <w:sz w:val="20"/>
+              </w:rPr>
+            </w:pPr>
+            <w:r>
+              <w:rPr>
+                <w:rFonts w:ascii="Arial" w:hAnsi="Arial" w:cs="Arial"/>
+                <w:sz w:val="20"/>
+              </w:rPr>
+              <w:drawing>
+                <wp:inline distT="0" distB="0" distL="0" distR="0" wp14:anchorId="2EE65796" wp14:editId="55BAE18B">
+                  <wp:extent cx="2415749" cy="1729890"/>
+                  <wp:effectExtent l="0" t="0" r="3810" b="3810"/>
+                  <wp:docPr id="1724822124" name="그림 1"/>
+                  <wp:cNvGraphicFramePr>
+                    <a:graphicFrameLocks xmlns:a="http://schemas.openxmlformats.org/drawingml/2006/main" noChangeAspect="1"/>
+                  </wp:cNvGraphicFramePr>
+                  <a:graphic xmlns:a="http://schemas.openxmlformats.org/drawingml/2006/main">
+                    <a:graphicData uri="http://schemas.openxmlformats.org/drawingml/2006/picture">
+                      <pic:pic xmlns:pic="http://schemas.openxmlformats.org/drawingml/2006/picture">
+                        <pic:nvPicPr>
+                          <pic:cNvPr id="1724822124" name=""/>
+                          <pic:cNvPicPr/>
+                        </pic:nvPicPr>
+                        <pic:blipFill>
+                          <a:blip r:embed="rId19"/>
+                          <a:stretch>
+                            <a:fillRect/>
+                          </a:stretch>
+                        </pic:blipFill>
+                        <pic:spPr>
+                          <a:xfrm>
+                            <a:off x="0" y="0"/>
+                            <a:ext cx="2415749" cy="1729890"/>
+                          </a:xfrm>
+                          <a:prstGeom prst="rect">
+                            <a:avLst/>
+                          </a:prstGeom>
+                        </pic:spPr>
+                      </pic:pic>
+                    </a:graphicData>
+                  </a:graphic>
+                </wp:inline>
+              </w:drawing>
+            </w:r>
+          </w:p>
+          <w:p>
+            <w:pPr>
+              <w:spacing w:after="0" w:line="240" w:lineRule="auto"/>
+              <w:rPr>
+                <w:rFonts w:ascii="Arial" w:hAnsi="Arial" w:cs="Arial"/>
+                <w:b w:val="0"/>
+                <w:bCs w:val="0"/>
+                <w:sz w:val="20"/>
+              </w:rPr>
+            </w:pPr>
+          </w:p>
+          <w:p>
+            <w:pPr>
+              <w:spacing w:after="0" w:line="240" w:lineRule="auto"/>
+              <w:rPr>
+                <w:rFonts w:ascii="Arial" w:hAnsi="Arial" w:cs="Arial" w:hint="eastAsia"/>
+                <w:sz w:val="20"/>
+              </w:rPr>
+            </w:pPr>
+            <w:r>
+              <w:rPr>
+                <w:rFonts w:ascii="Arial" w:hAnsi="Arial" w:cs="Arial"/>
+                <w:sz w:val="20"/>
+              </w:rPr>
+              <w:lastRenderedPageBreak/>
+              <w:drawing>
+                <wp:inline distT="0" distB="0" distL="0" distR="0" wp14:anchorId="2C541067" wp14:editId="300608A0">
+                  <wp:extent cx="3141980" cy="8697595"/>
+                  <wp:effectExtent l="0" t="0" r="1270" b="8255"/>
+                  <wp:docPr id="1402624821" name="그림 1"/>
+                  <wp:cNvGraphicFramePr>
+                    <a:graphicFrameLocks xmlns:a="http://schemas.openxmlformats.org/drawingml/2006/main" noChangeAspect="1"/>
+                  </wp:cNvGraphicFramePr>
+                  <a:graphic xmlns:a="http://schemas.openxmlformats.org/drawingml/2006/main">
+                    <a:graphicData uri="http://schemas.openxmlformats.org/drawingml/2006/picture">
+                      <pic:pic xmlns:pic="http://schemas.openxmlformats.org/drawingml/2006/picture">
+                        <pic:nvPicPr>
+                          <pic:cNvPr id="1402624821" name=""/>
+                          <pic:cNvPicPr/>
+                        </pic:nvPicPr>
+                        <pic:blipFill>
+                          <a:blip r:embed="rId20"/>
+                          <a:stretch>
+                            <a:fillRect/>
+                          </a:stretch>
+                        </pic:blipFill>
+                        <pic:spPr>
+                          <a:xfrm>
+                            <a:off x="0" y="0"/>
+                            <a:ext cx="3141980" cy="8697595"/>
+                          </a:xfrm>
+                          <a:prstGeom prst="rect">
+                            <a:avLst/>
+                          </a:prstGeom>
+                        </pic:spPr>
+                      </pic:pic>
+                    </a:graphicData>
+                  </a:graphic>
+                </wp:inline>
+              </w:drawing>
             </w:r>
           </w:p>
         </w:tc>
       </w:tr>
     </w:tbl>
-    <w:p/>
     <w:p>
       <w:pPr>
         <w:pStyle w:val="2"/>
       </w:pPr>
-      <w:proofErr w:type="spellStart"/>
       <w:r>
         <w:rPr>
           <w:rFonts w:hint="eastAsia"/>
         </w:rPr>
+        <w:lastRenderedPageBreak/>
         <w:t>Github</w:t>
       </w:r>
-      <w:proofErr w:type="spellEnd"/>
       <w:r>
         <w:t xml:space="preserve"> (Screen Shots)</w:t>
       </w:r>
@@ -2752,8 +2413,8 @@
         <w:tblLook w:val="04A0" w:firstRow="1" w:lastRow="0" w:firstColumn="1" w:lastColumn="0" w:noHBand="0" w:noVBand="1"/>
       </w:tblPr>
       <w:tblGrid>
-        <w:gridCol w:w="439"/>
-        <w:gridCol w:w="8577"/>
+        <w:gridCol w:w="737"/>
+        <w:gridCol w:w="8279"/>
       </w:tblGrid>
       <w:tr>
         <w:trPr>
@@ -2791,7 +2452,7 @@
                 <w:b w:val="0"/>
                 <w:sz w:val="20"/>
               </w:rPr>
-              <w:t>2</w:t>
+              <w:t>3</w:t>
             </w:r>
           </w:p>
         </w:tc>
@@ -2806,7 +2467,7 @@
               <w:jc w:val="both"/>
               <w:cnfStyle w:val="100000000000" w:firstRow="1" w:lastRow="0" w:firstColumn="0" w:lastColumn="0" w:oddVBand="0" w:evenVBand="0" w:oddHBand="0" w:evenHBand="0" w:firstRowFirstColumn="0" w:firstRowLastColumn="0" w:lastRowFirstColumn="0" w:lastRowLastColumn="0"/>
               <w:rPr>
-                <w:rFonts w:ascii="Arial" w:hAnsi="Arial" w:cs="Arial" w:hint="eastAsia"/>
+                <w:rFonts w:ascii="Arial" w:hAnsi="Arial" w:cs="Arial"/>
                 <w:b w:val="0"/>
                 <w:sz w:val="20"/>
               </w:rPr>
@@ -2825,18 +2486,8 @@
                 <w:b w:val="0"/>
                 <w:sz w:val="20"/>
               </w:rPr>
-              <w:t xml:space="preserve"> </w:t>
-            </w:r>
-            <w:proofErr w:type="spellStart"/>
-            <w:r>
-              <w:rPr>
-                <w:rFonts w:ascii="Arial" w:hAnsi="Arial" w:cs="Arial" w:hint="eastAsia"/>
-                <w:b w:val="0"/>
-                <w:sz w:val="20"/>
-              </w:rPr>
-              <w:t>Github</w:t>
-            </w:r>
-            <w:proofErr w:type="spellEnd"/>
+              <w:t xml:space="preserve"> Github</w:t>
+            </w:r>
             <w:r>
               <w:rPr>
                 <w:rFonts w:ascii="Arial" w:hAnsi="Arial" w:cs="Arial" w:hint="eastAsia"/>
@@ -2987,15 +2638,47 @@
                 <w:sz w:val="20"/>
               </w:rPr>
             </w:pPr>
-          </w:p>
-          <w:p>
-            <w:pPr>
-              <w:spacing w:after="0" w:line="240" w:lineRule="auto"/>
-              <w:rPr>
-                <w:rFonts w:ascii="Arial" w:hAnsi="Arial" w:cs="Arial"/>
-                <w:sz w:val="20"/>
-              </w:rPr>
-            </w:pPr>
+            <w:r>
+              <w:rPr>
+                <w:rFonts w:ascii="Arial" w:hAnsi="Arial" w:cs="Arial"/>
+                <w:sz w:val="20"/>
+              </w:rPr>
+              <w:drawing>
+                <wp:inline distT="0" distB="0" distL="0" distR="0" wp14:anchorId="3D422AC4" wp14:editId="2E6F7859">
+                  <wp:extent cx="5731510" cy="6872605"/>
+                  <wp:effectExtent l="0" t="0" r="2540" b="4445"/>
+                  <wp:docPr id="773531506" name="그림 1"/>
+                  <wp:cNvGraphicFramePr>
+                    <a:graphicFrameLocks xmlns:a="http://schemas.openxmlformats.org/drawingml/2006/main" noChangeAspect="1"/>
+                  </wp:cNvGraphicFramePr>
+                  <a:graphic xmlns:a="http://schemas.openxmlformats.org/drawingml/2006/main">
+                    <a:graphicData uri="http://schemas.openxmlformats.org/drawingml/2006/picture">
+                      <pic:pic xmlns:pic="http://schemas.openxmlformats.org/drawingml/2006/picture">
+                        <pic:nvPicPr>
+                          <pic:cNvPr id="773531506" name=""/>
+                          <pic:cNvPicPr/>
+                        </pic:nvPicPr>
+                        <pic:blipFill>
+                          <a:blip r:embed="rId21"/>
+                          <a:stretch>
+                            <a:fillRect/>
+                          </a:stretch>
+                        </pic:blipFill>
+                        <pic:spPr>
+                          <a:xfrm>
+                            <a:off x="0" y="0"/>
+                            <a:ext cx="5731510" cy="6872605"/>
+                          </a:xfrm>
+                          <a:prstGeom prst="rect">
+                            <a:avLst/>
+                          </a:prstGeom>
+                        </pic:spPr>
+                      </pic:pic>
+                    </a:graphicData>
+                  </a:graphic>
+                </wp:inline>
+              </w:drawing>
+            </w:r>
           </w:p>
           <w:p>
             <w:pPr>
@@ -3033,7 +2716,6 @@
         <w:spacing w:after="160" w:line="259" w:lineRule="auto"/>
         <w:jc w:val="both"/>
         <w:rPr>
-          <w:rFonts w:hint="eastAsia"/>
           <w:b/>
           <w:bCs/>
           <w:caps/>
@@ -3916,10 +3598,28 @@
       <w:sz w:val="24"/>
     </w:rPr>
   </w:style>
+  <w:style w:type="paragraph" w:styleId="3">
+    <w:name w:val="heading 3"/>
+    <w:basedOn w:val="a0"/>
+    <w:next w:val="a0"/>
+    <w:link w:val="3Char"/>
+    <w:uiPriority w:val="9"/>
+    <w:semiHidden/>
+    <w:unhideWhenUsed/>
+    <w:qFormat/>
+    <w:rsid w:val="007E32C0"/>
+    <w:pPr>
+      <w:keepNext/>
+      <w:ind w:leftChars="300" w:left="300" w:hangingChars="200" w:hanging="2000"/>
+      <w:outlineLvl w:val="2"/>
+    </w:pPr>
+    <w:rPr>
+      <w:rFonts w:asciiTheme="majorHAnsi" w:eastAsiaTheme="majorEastAsia" w:hAnsiTheme="majorHAnsi" w:cstheme="majorBidi"/>
+    </w:rPr>
+  </w:style>
   <w:style w:type="character" w:default="1" w:styleId="a1">
     <w:name w:val="Default Paragraph Font"/>
     <w:uiPriority w:val="1"/>
-    <w:semiHidden/>
     <w:unhideWhenUsed/>
   </w:style>
   <w:style w:type="table" w:default="1" w:styleId="a2">
@@ -4618,6 +4318,21 @@
       <w:shd w:val="clear" w:color="auto" w:fill="E1DFDD"/>
     </w:rPr>
   </w:style>
+  <w:style w:type="character" w:customStyle="1" w:styleId="3Char">
+    <w:name w:val="제목 3 Char"/>
+    <w:basedOn w:val="a1"/>
+    <w:link w:val="3"/>
+    <w:uiPriority w:val="9"/>
+    <w:semiHidden/>
+    <w:rsid w:val="007E32C0"/>
+    <w:rPr>
+      <w:rFonts w:asciiTheme="majorHAnsi" w:eastAsiaTheme="majorEastAsia" w:hAnsiTheme="majorHAnsi" w:cstheme="majorBidi"/>
+      <w:color w:val="404040" w:themeColor="text1" w:themeTint="BF"/>
+      <w:kern w:val="0"/>
+      <w:sz w:val="18"/>
+      <w:szCs w:val="20"/>
+    </w:rPr>
+  </w:style>
 </w:styles>
 </file>
 
@@ -4745,6 +4460,7 @@
     <w:rsid w:val="001E37F5"/>
     <w:rsid w:val="00416E4F"/>
     <w:rsid w:val="00446146"/>
+    <w:rsid w:val="004A4723"/>
     <w:rsid w:val="00576A1B"/>
     <w:rsid w:val="005A346B"/>
     <w:rsid w:val="007C31F8"/>
@@ -4755,6 +4471,7 @@
     <w:rsid w:val="00B07AA4"/>
     <w:rsid w:val="00BA581E"/>
     <w:rsid w:val="00C330BD"/>
+    <w:rsid w:val="00EA67C7"/>
     <w:rsid w:val="00EF0A92"/>
     <w:rsid w:val="00F16EAE"/>
     <w:rsid w:val="00F277B0"/>

</xml_diff>